<commit_message>
docs(cahier-des-charges): fusion du document collegue - ajout des 10 sections manquantes (tests, risques, livrables, evaluation, reception)
</commit_message>
<xml_diff>
--- a/docs/Cahier_des_Charges_CineTrekker.docx
+++ b/docs/Cahier_des_Charges_CineTrekker.docx
@@ -4279,6 +4279,3079 @@
       <w:pPr/>
       <w:r>
         <w:t xml:space="preserve">L'objectif de moins de 35 USD est une cible de gestion de projet, non une estimation tarifaire garantie ; une destruction n'annule pas les coûts déjà générés.</w:t>
+      </w:r>
+    </w:p>
+    <w:p>
+      <w:r>
+        <w:br w:type="page"/>
+      </w:r>
+    </w:p>
+    <w:p>
+      <w:pPr>
+        <w:pStyle w:val="Heading1"/>
+        <w:spacing w:before="360" w:after="120"/>
+      </w:pPr>
+      <w:r>
+        <w:rPr>
+          <w:color w:val="004E9A"/>
+          <w:sz w:val="32"/>
+        </w:rPr>
+        <w:t>ANNEXE A — Structure du Depot Git</w:t>
+      </w:r>
+    </w:p>
+    <w:p>
+      <w:pPr>
+        <w:spacing w:after="80"/>
+      </w:pPr>
+      <w:r>
+        <w:rPr>
+          <w:sz w:val="22"/>
+        </w:rPr>
+        <w:t>La structure en place couvre les responsabilites suivantes :</w:t>
+      </w:r>
+    </w:p>
+    <w:tbl>
+      <w:tblPr>
+        <w:tblStyle w:val="TableGrid"/>
+        <w:tblW w:type="auto" w:w="0"/>
+        <w:tblLook w:firstColumn="1" w:firstRow="1" w:lastColumn="0" w:lastRow="0" w:noHBand="0" w:noVBand="1" w:val="04A0"/>
+      </w:tblPr>
+      <w:tblGrid>
+        <w:gridCol w:w="4680"/>
+        <w:gridCol w:w="4680"/>
+      </w:tblGrid>
+      <w:tr>
+        <w:tc>
+          <w:tcPr>
+            <w:tcW w:type="dxa" w:w="4680"/>
+            <w:shd w:val="clear" w:color="auto" w:fill="004E9A"/>
+          </w:tcPr>
+          <w:p>
+            <w:r>
+              <w:rPr>
+                <w:b/>
+                <w:color w:val="FFFFFF"/>
+                <w:sz w:val="18"/>
+              </w:rPr>
+              <w:t>Repertoire / Fichier</w:t>
+            </w:r>
+          </w:p>
+        </w:tc>
+        <w:tc>
+          <w:tcPr>
+            <w:tcW w:type="dxa" w:w="4680"/>
+            <w:shd w:val="clear" w:color="auto" w:fill="004E9A"/>
+          </w:tcPr>
+          <w:p>
+            <w:r>
+              <w:rPr>
+                <w:b/>
+                <w:color w:val="FFFFFF"/>
+                <w:sz w:val="18"/>
+              </w:rPr>
+              <w:t>Contenu attendu</w:t>
+            </w:r>
+          </w:p>
+        </w:tc>
+      </w:tr>
+      <w:tr>
+        <w:tc>
+          <w:tcPr>
+            <w:tcW w:type="dxa" w:w="4680"/>
+          </w:tcPr>
+          <w:p>
+            <w:r>
+              <w:rPr>
+                <w:sz w:val="18"/>
+              </w:rPr>
+              <w:t>infra/</w:t>
+            </w:r>
+          </w:p>
+        </w:tc>
+        <w:tc>
+          <w:tcPr>
+            <w:tcW w:type="dxa" w:w="4680"/>
+          </w:tcPr>
+          <w:p>
+            <w:r>
+              <w:rPr>
+                <w:sz w:val="18"/>
+              </w:rPr>
+              <w:t>Code Terraform, environnements (dev) et modules d'infrastructure (reseau, securite, stockage, calcul)</w:t>
+            </w:r>
+          </w:p>
+        </w:tc>
+      </w:tr>
+      <w:tr>
+        <w:tc>
+          <w:tcPr>
+            <w:tcW w:type="dxa" w:w="4680"/>
+            <w:shd w:val="clear" w:color="auto" w:fill="EAF0FB"/>
+          </w:tcPr>
+          <w:p>
+            <w:r>
+              <w:rPr>
+                <w:sz w:val="18"/>
+              </w:rPr>
+              <w:t>app/</w:t>
+            </w:r>
+          </w:p>
+        </w:tc>
+        <w:tc>
+          <w:tcPr>
+            <w:tcW w:type="dxa" w:w="4680"/>
+            <w:shd w:val="clear" w:color="auto" w:fill="EAF0FB"/>
+          </w:tcPr>
+          <w:p>
+            <w:r>
+              <w:rPr>
+                <w:sz w:val="18"/>
+              </w:rPr>
+              <w:t>Code de l'application CineTrekker et elements necessaires a son empaquetage (dist/, server.js)</w:t>
+            </w:r>
+          </w:p>
+        </w:tc>
+      </w:tr>
+      <w:tr>
+        <w:tc>
+          <w:tcPr>
+            <w:tcW w:type="dxa" w:w="4680"/>
+          </w:tcPr>
+          <w:p>
+            <w:r>
+              <w:rPr>
+                <w:sz w:val="18"/>
+              </w:rPr>
+              <w:t>scripts/</w:t>
+            </w:r>
+          </w:p>
+        </w:tc>
+        <w:tc>
+          <w:tcPr>
+            <w:tcW w:type="dxa" w:w="4680"/>
+          </w:tcPr>
+          <w:p>
+            <w:r>
+              <w:rPr>
+                <w:sz w:val="18"/>
+              </w:rPr>
+              <w:t>Deploiement (deploy.ps1/.sh), destruction (destroy.ps1/.sh), lanceurs 1-clic (.bat)</w:t>
+            </w:r>
+          </w:p>
+        </w:tc>
+      </w:tr>
+      <w:tr>
+        <w:tc>
+          <w:tcPr>
+            <w:tcW w:type="dxa" w:w="4680"/>
+            <w:shd w:val="clear" w:color="auto" w:fill="EAF0FB"/>
+          </w:tcPr>
+          <w:p>
+            <w:r>
+              <w:rPr>
+                <w:sz w:val="18"/>
+              </w:rPr>
+              <w:t>docs/</w:t>
+            </w:r>
+          </w:p>
+        </w:tc>
+        <w:tc>
+          <w:tcPr>
+            <w:tcW w:type="dxa" w:w="4680"/>
+            <w:shd w:val="clear" w:color="auto" w:fill="EAF0FB"/>
+          </w:tcPr>
+          <w:p>
+            <w:r>
+              <w:rPr>
+                <w:sz w:val="18"/>
+              </w:rPr>
+              <w:t>Cahier des charges, architecture, decisions, exploitation, incidents, mesures et journaux</w:t>
+            </w:r>
+          </w:p>
+        </w:tc>
+      </w:tr>
+      <w:tr>
+        <w:tc>
+          <w:tcPr>
+            <w:tcW w:type="dxa" w:w="4680"/>
+          </w:tcPr>
+          <w:p>
+            <w:r>
+              <w:rPr>
+                <w:sz w:val="18"/>
+              </w:rPr>
+              <w:t>README.md</w:t>
+            </w:r>
+          </w:p>
+        </w:tc>
+        <w:tc>
+          <w:tcPr>
+            <w:tcW w:type="dxa" w:w="4680"/>
+          </w:tcPr>
+          <w:p>
+            <w:r>
+              <w:rPr>
+                <w:sz w:val="18"/>
+              </w:rPr>
+              <w:t>Demarrage, rechargement des identifiants, deploiement, validation et destruction</w:t>
+            </w:r>
+          </w:p>
+        </w:tc>
+      </w:tr>
+      <w:tr>
+        <w:tc>
+          <w:tcPr>
+            <w:tcW w:type="dxa" w:w="4680"/>
+            <w:shd w:val="clear" w:color="auto" w:fill="EAF0FB"/>
+          </w:tcPr>
+          <w:p>
+            <w:r>
+              <w:rPr>
+                <w:sz w:val="18"/>
+              </w:rPr>
+              <w:t>.gitignore</w:t>
+            </w:r>
+          </w:p>
+        </w:tc>
+        <w:tc>
+          <w:tcPr>
+            <w:tcW w:type="dxa" w:w="4680"/>
+            <w:shd w:val="clear" w:color="auto" w:fill="EAF0FB"/>
+          </w:tcPr>
+          <w:p>
+            <w:r>
+              <w:rPr>
+                <w:sz w:val="18"/>
+              </w:rPr>
+              <w:t>Exclusion des secrets, fichiers d'etat Terraform (.tfstate), variables locales et artefacts binaires</w:t>
+            </w:r>
+          </w:p>
+        </w:tc>
+      </w:tr>
+    </w:tbl>
+    <w:p/>
+    <w:p>
+      <w:pPr>
+        <w:pStyle w:val="Heading1"/>
+        <w:spacing w:before="360" w:after="120"/>
+      </w:pPr>
+      <w:r>
+        <w:rPr>
+          <w:color w:val="004E9A"/>
+          <w:sz w:val="32"/>
+        </w:rPr>
+        <w:t>ANNEXE B — Exigences Fonctionnelles</w:t>
+      </w:r>
+    </w:p>
+    <w:tbl>
+      <w:tblPr>
+        <w:tblStyle w:val="TableGrid"/>
+        <w:tblW w:type="auto" w:w="0"/>
+        <w:tblLook w:firstColumn="1" w:firstRow="1" w:lastColumn="0" w:lastRow="0" w:noHBand="0" w:noVBand="1" w:val="04A0"/>
+      </w:tblPr>
+      <w:tblGrid>
+        <w:gridCol w:w="3120"/>
+        <w:gridCol w:w="3120"/>
+        <w:gridCol w:w="3120"/>
+      </w:tblGrid>
+      <w:tr>
+        <w:tc>
+          <w:tcPr>
+            <w:tcW w:type="dxa" w:w="3120"/>
+            <w:shd w:val="clear" w:color="auto" w:fill="004E9A"/>
+          </w:tcPr>
+          <w:p>
+            <w:r>
+              <w:rPr>
+                <w:b/>
+                <w:color w:val="FFFFFF"/>
+                <w:sz w:val="18"/>
+              </w:rPr>
+              <w:t>ID</w:t>
+            </w:r>
+          </w:p>
+        </w:tc>
+        <w:tc>
+          <w:tcPr>
+            <w:tcW w:type="dxa" w:w="3120"/>
+            <w:shd w:val="clear" w:color="auto" w:fill="004E9A"/>
+          </w:tcPr>
+          <w:p>
+            <w:r>
+              <w:rPr>
+                <w:b/>
+                <w:color w:val="FFFFFF"/>
+                <w:sz w:val="18"/>
+              </w:rPr>
+              <w:t>Exigence</w:t>
+            </w:r>
+          </w:p>
+        </w:tc>
+        <w:tc>
+          <w:tcPr>
+            <w:tcW w:type="dxa" w:w="3120"/>
+            <w:shd w:val="clear" w:color="auto" w:fill="004E9A"/>
+          </w:tcPr>
+          <w:p>
+            <w:r>
+              <w:rPr>
+                <w:b/>
+                <w:color w:val="FFFFFF"/>
+                <w:sz w:val="18"/>
+              </w:rPr>
+              <w:t>Critere de validation</w:t>
+            </w:r>
+          </w:p>
+        </w:tc>
+      </w:tr>
+      <w:tr>
+        <w:tc>
+          <w:tcPr>
+            <w:tcW w:type="dxa" w:w="3120"/>
+          </w:tcPr>
+          <w:p>
+            <w:r>
+              <w:rPr>
+                <w:sz w:val="18"/>
+              </w:rPr>
+              <w:t>F-01</w:t>
+            </w:r>
+          </w:p>
+        </w:tc>
+        <w:tc>
+          <w:tcPr>
+            <w:tcW w:type="dxa" w:w="3120"/>
+          </w:tcPr>
+          <w:p>
+            <w:r>
+              <w:rPr>
+                <w:sz w:val="18"/>
+              </w:rPr>
+              <w:t>L'utilisateur acceede a CineTrekker via l'URL de l'ALB</w:t>
+            </w:r>
+          </w:p>
+        </w:tc>
+        <w:tc>
+          <w:tcPr>
+            <w:tcW w:type="dxa" w:w="3120"/>
+          </w:tcPr>
+          <w:p>
+            <w:r>
+              <w:rPr>
+                <w:sz w:val="18"/>
+              </w:rPr>
+              <w:t>Page d'accueil servie avec succes par le point d'entree public</w:t>
+            </w:r>
+          </w:p>
+        </w:tc>
+      </w:tr>
+      <w:tr>
+        <w:tc>
+          <w:tcPr>
+            <w:tcW w:type="dxa" w:w="3120"/>
+            <w:shd w:val="clear" w:color="auto" w:fill="EAF0FB"/>
+          </w:tcPr>
+          <w:p>
+            <w:r>
+              <w:rPr>
+                <w:sz w:val="18"/>
+              </w:rPr>
+              <w:t>F-02</w:t>
+            </w:r>
+          </w:p>
+        </w:tc>
+        <w:tc>
+          <w:tcPr>
+            <w:tcW w:type="dxa" w:w="3120"/>
+            <w:shd w:val="clear" w:color="auto" w:fill="EAF0FB"/>
+          </w:tcPr>
+          <w:p>
+            <w:r>
+              <w:rPr>
+                <w:sz w:val="18"/>
+              </w:rPr>
+              <w:t>L'ALB distribue les requetes vers les instances applicatives saines</w:t>
+            </w:r>
+          </w:p>
+        </w:tc>
+        <w:tc>
+          <w:tcPr>
+            <w:tcW w:type="dxa" w:w="3120"/>
+            <w:shd w:val="clear" w:color="auto" w:fill="EAF0FB"/>
+          </w:tcPr>
+          <w:p>
+            <w:r>
+              <w:rPr>
+                <w:sz w:val="18"/>
+              </w:rPr>
+              <w:t>Cibles enregistrees et etat de sante consultable</w:t>
+            </w:r>
+          </w:p>
+        </w:tc>
+      </w:tr>
+      <w:tr>
+        <w:tc>
+          <w:tcPr>
+            <w:tcW w:type="dxa" w:w="3120"/>
+          </w:tcPr>
+          <w:p>
+            <w:r>
+              <w:rPr>
+                <w:sz w:val="18"/>
+              </w:rPr>
+              <w:t>F-03</w:t>
+            </w:r>
+          </w:p>
+        </w:tc>
+        <w:tc>
+          <w:tcPr>
+            <w:tcW w:type="dxa" w:w="3120"/>
+          </w:tcPr>
+          <w:p>
+            <w:r>
+              <w:rPr>
+                <w:sz w:val="18"/>
+              </w:rPr>
+              <w:t>Une instance defaillante est retiree du trafic puis remplacee</w:t>
+            </w:r>
+          </w:p>
+        </w:tc>
+        <w:tc>
+          <w:tcPr>
+            <w:tcW w:type="dxa" w:w="3120"/>
+          </w:tcPr>
+          <w:p>
+            <w:r>
+              <w:rPr>
+                <w:sz w:val="18"/>
+              </w:rPr>
+              <w:t>Echec de sante observe, remplacement ASG confirme</w:t>
+            </w:r>
+          </w:p>
+        </w:tc>
+      </w:tr>
+      <w:tr>
+        <w:tc>
+          <w:tcPr>
+            <w:tcW w:type="dxa" w:w="3120"/>
+            <w:shd w:val="clear" w:color="auto" w:fill="EAF0FB"/>
+          </w:tcPr>
+          <w:p>
+            <w:r>
+              <w:rPr>
+                <w:sz w:val="18"/>
+              </w:rPr>
+              <w:t>F-04</w:t>
+            </w:r>
+          </w:p>
+        </w:tc>
+        <w:tc>
+          <w:tcPr>
+            <w:tcW w:type="dxa" w:w="3120"/>
+            <w:shd w:val="clear" w:color="auto" w:fill="EAF0FB"/>
+          </w:tcPr>
+          <w:p>
+            <w:r>
+              <w:rPr>
+                <w:sz w:val="18"/>
+              </w:rPr>
+              <w:t>L'application expose un controle de sante /health</w:t>
+            </w:r>
+          </w:p>
+        </w:tc>
+        <w:tc>
+          <w:tcPr>
+            <w:tcW w:type="dxa" w:w="3120"/>
+            <w:shd w:val="clear" w:color="auto" w:fill="EAF0FB"/>
+          </w:tcPr>
+          <w:p>
+            <w:r>
+              <w:rPr>
+                <w:sz w:val="18"/>
+              </w:rPr>
+              <w:t>Reponse valide HTTP 200 JSON sur le port 8080 depuis le Target Group</w:t>
+            </w:r>
+          </w:p>
+        </w:tc>
+      </w:tr>
+      <w:tr>
+        <w:tc>
+          <w:tcPr>
+            <w:tcW w:type="dxa" w:w="3120"/>
+          </w:tcPr>
+          <w:p>
+            <w:r>
+              <w:rPr>
+                <w:sz w:val="18"/>
+              </w:rPr>
+              <w:t>F-05</w:t>
+            </w:r>
+          </w:p>
+        </w:tc>
+        <w:tc>
+          <w:tcPr>
+            <w:tcW w:type="dxa" w:w="3120"/>
+          </w:tcPr>
+          <w:p>
+            <w:r>
+              <w:rPr>
+                <w:sz w:val="18"/>
+              </w:rPr>
+              <w:t>Les donnees persistantes sont stockees dans RDS</w:t>
+            </w:r>
+          </w:p>
+        </w:tc>
+        <w:tc>
+          <w:tcPr>
+            <w:tcW w:type="dxa" w:w="3120"/>
+          </w:tcPr>
+          <w:p>
+            <w:r>
+              <w:rPr>
+                <w:sz w:val="18"/>
+              </w:rPr>
+              <w:t>Connexion depuis l'application et refus d'acces depuis Internet</w:t>
+            </w:r>
+          </w:p>
+        </w:tc>
+      </w:tr>
+      <w:tr>
+        <w:tc>
+          <w:tcPr>
+            <w:tcW w:type="dxa" w:w="3120"/>
+            <w:shd w:val="clear" w:color="auto" w:fill="EAF0FB"/>
+          </w:tcPr>
+          <w:p>
+            <w:r>
+              <w:rPr>
+                <w:sz w:val="18"/>
+              </w:rPr>
+              <w:t>F-06</w:t>
+            </w:r>
+          </w:p>
+        </w:tc>
+        <w:tc>
+          <w:tcPr>
+            <w:tcW w:type="dxa" w:w="3120"/>
+            <w:shd w:val="clear" w:color="auto" w:fill="EAF0FB"/>
+          </w:tcPr>
+          <w:p>
+            <w:r>
+              <w:rPr>
+                <w:sz w:val="18"/>
+              </w:rPr>
+              <w:t>L'artefact applicatif est recuperable depuis S3</w:t>
+            </w:r>
+          </w:p>
+        </w:tc>
+        <w:tc>
+          <w:tcPr>
+            <w:tcW w:type="dxa" w:w="3120"/>
+            <w:shd w:val="clear" w:color="auto" w:fill="EAF0FB"/>
+          </w:tcPr>
+          <w:p>
+            <w:r>
+              <w:rPr>
+                <w:sz w:val="18"/>
+              </w:rPr>
+              <w:t>Acces depuis le role prevu (LabInstanceProfile) et absence d'acces public</w:t>
+            </w:r>
+          </w:p>
+        </w:tc>
+      </w:tr>
+      <w:tr>
+        <w:tc>
+          <w:tcPr>
+            <w:tcW w:type="dxa" w:w="3120"/>
+          </w:tcPr>
+          <w:p>
+            <w:r>
+              <w:rPr>
+                <w:sz w:val="18"/>
+              </w:rPr>
+              <w:t>F-07</w:t>
+            </w:r>
+          </w:p>
+        </w:tc>
+        <w:tc>
+          <w:tcPr>
+            <w:tcW w:type="dxa" w:w="3120"/>
+          </w:tcPr>
+          <w:p>
+            <w:r>
+              <w:rPr>
+                <w:sz w:val="18"/>
+              </w:rPr>
+              <w:t>Le deploiement et la destruction sont automatises</w:t>
+            </w:r>
+          </w:p>
+        </w:tc>
+        <w:tc>
+          <w:tcPr>
+            <w:tcW w:type="dxa" w:w="3120"/>
+          </w:tcPr>
+          <w:p>
+            <w:r>
+              <w:rPr>
+                <w:sz w:val="18"/>
+              </w:rPr>
+              <w:t>Scripts documentes executables depuis un environnement propre en 1 clic</w:t>
+            </w:r>
+          </w:p>
+        </w:tc>
+      </w:tr>
+      <w:tr>
+        <w:tc>
+          <w:tcPr>
+            <w:tcW w:type="dxa" w:w="3120"/>
+            <w:shd w:val="clear" w:color="auto" w:fill="EAF0FB"/>
+          </w:tcPr>
+          <w:p>
+            <w:r>
+              <w:rPr>
+                <w:sz w:val="18"/>
+              </w:rPr>
+              <w:t>F-08</w:t>
+            </w:r>
+          </w:p>
+        </w:tc>
+        <w:tc>
+          <w:tcPr>
+            <w:tcW w:type="dxa" w:w="3120"/>
+            <w:shd w:val="clear" w:color="auto" w:fill="EAF0FB"/>
+          </w:tcPr>
+          <w:p>
+            <w:r>
+              <w:rPr>
+                <w:sz w:val="18"/>
+              </w:rPr>
+              <w:t>Une version applicative peut etre publiee de facon controlee</w:t>
+            </w:r>
+          </w:p>
+        </w:tc>
+        <w:tc>
+          <w:tcPr>
+            <w:tcW w:type="dxa" w:w="3120"/>
+            <w:shd w:val="clear" w:color="auto" w:fill="EAF0FB"/>
+          </w:tcPr>
+          <w:p>
+            <w:r>
+              <w:rPr>
+                <w:sz w:val="18"/>
+              </w:rPr>
+              <w:t>Procedure de mise a jour testee et resultat verifie</w:t>
+            </w:r>
+          </w:p>
+        </w:tc>
+      </w:tr>
+      <w:tr>
+        <w:tc>
+          <w:tcPr>
+            <w:tcW w:type="dxa" w:w="3120"/>
+          </w:tcPr>
+          <w:p>
+            <w:r>
+              <w:rPr>
+                <w:sz w:val="18"/>
+              </w:rPr>
+              <w:t>F-09</w:t>
+            </w:r>
+          </w:p>
+        </w:tc>
+        <w:tc>
+          <w:tcPr>
+            <w:tcW w:type="dxa" w:w="3120"/>
+          </w:tcPr>
+          <w:p>
+            <w:r>
+              <w:rPr>
+                <w:sz w:val="18"/>
+              </w:rPr>
+              <w:t>Les evenements et metriques utiles sont consultables</w:t>
+            </w:r>
+          </w:p>
+        </w:tc>
+        <w:tc>
+          <w:tcPr>
+            <w:tcW w:type="dxa" w:w="3120"/>
+          </w:tcPr>
+          <w:p>
+            <w:r>
+              <w:rPr>
+                <w:sz w:val="18"/>
+              </w:rPr>
+              <w:t>Journaux CloudWatch, tableau de bord et 2 alarmes presents et testes</w:t>
+            </w:r>
+          </w:p>
+        </w:tc>
+      </w:tr>
+    </w:tbl>
+    <w:p/>
+    <w:p>
+      <w:pPr>
+        <w:pStyle w:val="Heading1"/>
+        <w:spacing w:before="360" w:after="120"/>
+      </w:pPr>
+      <w:r>
+        <w:rPr>
+          <w:color w:val="004E9A"/>
+          <w:sz w:val="32"/>
+        </w:rPr>
+        <w:t>ANNEXE C — Exigences Non Fonctionnelles</w:t>
+      </w:r>
+    </w:p>
+    <w:p>
+      <w:pPr>
+        <w:pStyle w:val="ListParagraph"/>
+        <w:spacing w:after="40"/>
+        <w:ind w:left="425"/>
+      </w:pPr>
+      <w:r>
+        <w:rPr>
+          <w:b/>
+          <w:sz w:val="22"/>
+        </w:rPr>
+        <w:t xml:space="preserve">•  Reproductibilite : </w:t>
+      </w:r>
+      <w:r>
+        <w:rPr>
+          <w:sz w:val="22"/>
+        </w:rPr>
+        <w:t>Ressources reconstruites depuis le depot, sans etapes AWS manuelles non documentees.</w:t>
+      </w:r>
+    </w:p>
+    <w:p>
+      <w:pPr>
+        <w:pStyle w:val="ListParagraph"/>
+        <w:spacing w:after="40"/>
+        <w:ind w:left="425"/>
+      </w:pPr>
+      <w:r>
+        <w:rPr>
+          <w:b/>
+          <w:sz w:val="22"/>
+        </w:rPr>
+        <w:t xml:space="preserve">•  Disponibilite : </w:t>
+      </w:r>
+      <w:r>
+        <w:rPr>
+          <w:sz w:val="22"/>
+        </w:rPr>
+        <w:t>La perte d'une instance applicative n'empeche pas l'acces au service pendant le test.</w:t>
+      </w:r>
+    </w:p>
+    <w:p>
+      <w:pPr>
+        <w:pStyle w:val="ListParagraph"/>
+        <w:spacing w:after="40"/>
+        <w:ind w:left="425"/>
+      </w:pPr>
+      <w:r>
+        <w:rPr>
+          <w:b/>
+          <w:sz w:val="22"/>
+        </w:rPr>
+        <w:t xml:space="preserve">•  Securite : </w:t>
+      </w:r>
+      <w:r>
+        <w:rPr>
+          <w:sz w:val="22"/>
+        </w:rPr>
+        <w:t>RDS prive, entrees restreintes, chiffrement au repos active, secrets absents du depot.</w:t>
+      </w:r>
+    </w:p>
+    <w:p>
+      <w:pPr>
+        <w:pStyle w:val="ListParagraph"/>
+        <w:spacing w:after="40"/>
+        <w:ind w:left="425"/>
+      </w:pPr>
+      <w:r>
+        <w:rPr>
+          <w:b/>
+          <w:sz w:val="22"/>
+        </w:rPr>
+        <w:t xml:space="preserve">•  Observabilite : </w:t>
+      </w:r>
+      <w:r>
+        <w:rPr>
+          <w:sz w:val="22"/>
+        </w:rPr>
+        <w:t>Un incident injecte peut etre detecte et diagnostique a partir des metriques et journaux.</w:t>
+      </w:r>
+    </w:p>
+    <w:p>
+      <w:pPr>
+        <w:pStyle w:val="ListParagraph"/>
+        <w:spacing w:after="40"/>
+        <w:ind w:left="425"/>
+      </w:pPr>
+      <w:r>
+        <w:rPr>
+          <w:b/>
+          <w:sz w:val="22"/>
+        </w:rPr>
+        <w:t xml:space="preserve">•  Maintenabilite : </w:t>
+      </w:r>
+      <w:r>
+        <w:rPr>
+          <w:sz w:val="22"/>
+        </w:rPr>
+        <w:t>Modules Terraform et scripts nommes selon leur responsabilite, parametres documentes, historique Git intelligible.</w:t>
+      </w:r>
+    </w:p>
+    <w:p>
+      <w:pPr>
+        <w:pStyle w:val="ListParagraph"/>
+        <w:spacing w:after="40"/>
+        <w:ind w:left="425"/>
+      </w:pPr>
+      <w:r>
+        <w:rPr>
+          <w:b/>
+          <w:sz w:val="22"/>
+        </w:rPr>
+        <w:t xml:space="preserve">•  Cout : </w:t>
+      </w:r>
+      <w:r>
+        <w:rPr>
+          <w:sz w:val="22"/>
+        </w:rPr>
+        <w:t>Estimation et suivi par seance, destruction des ressources facturees a l'heure sans oubli.</w:t>
+      </w:r>
+    </w:p>
+    <w:p>
+      <w:pPr>
+        <w:pStyle w:val="ListParagraph"/>
+        <w:spacing w:after="40"/>
+        <w:ind w:left="425"/>
+      </w:pPr>
+      <w:r>
+        <w:rPr>
+          <w:b/>
+          <w:sz w:val="22"/>
+        </w:rPr>
+        <w:t xml:space="preserve">•  Resilience des donnees : </w:t>
+      </w:r>
+      <w:r>
+        <w:rPr>
+          <w:sz w:val="22"/>
+        </w:rPr>
+        <w:t>Procedure de sauvegarde et de restauration eprouvee, avec mesures de RPO (24h) et RTO (&lt; 15 min).</w:t>
+      </w:r>
+    </w:p>
+    <w:p/>
+    <w:p>
+      <w:pPr>
+        <w:pStyle w:val="Heading1"/>
+        <w:spacing w:before="360" w:after="120"/>
+      </w:pPr>
+      <w:r>
+        <w:rPr>
+          <w:color w:val="004E9A"/>
+          <w:sz w:val="32"/>
+        </w:rPr>
+        <w:t>ANNEXE D — Plan de Tests et Criteres d'Acceptation</w:t>
+      </w:r>
+    </w:p>
+    <w:p>
+      <w:pPr>
+        <w:spacing w:after="80"/>
+      </w:pPr>
+      <w:r>
+        <w:rPr>
+          <w:sz w:val="22"/>
+        </w:rPr>
+        <w:t>Les resultats sont consignes avec horodatage, contexte, commandes non sensibles et captures. Aucun secret ni jeton ne doit apparaitre dans les preuves.</w:t>
+      </w:r>
+    </w:p>
+    <w:tbl>
+      <w:tblPr>
+        <w:tblStyle w:val="TableGrid"/>
+        <w:tblW w:type="auto" w:w="0"/>
+        <w:tblLook w:firstColumn="1" w:firstRow="1" w:lastColumn="0" w:lastRow="0" w:noHBand="0" w:noVBand="1" w:val="04A0"/>
+      </w:tblPr>
+      <w:tblGrid>
+        <w:gridCol w:w="3120"/>
+        <w:gridCol w:w="3120"/>
+        <w:gridCol w:w="3120"/>
+      </w:tblGrid>
+      <w:tr>
+        <w:tc>
+          <w:tcPr>
+            <w:tcW w:type="dxa" w:w="3120"/>
+            <w:shd w:val="clear" w:color="auto" w:fill="004E9A"/>
+          </w:tcPr>
+          <w:p>
+            <w:r>
+              <w:rPr>
+                <w:b/>
+                <w:color w:val="FFFFFF"/>
+                <w:sz w:val="18"/>
+              </w:rPr>
+              <w:t>Test</w:t>
+            </w:r>
+          </w:p>
+        </w:tc>
+        <w:tc>
+          <w:tcPr>
+            <w:tcW w:type="dxa" w:w="3120"/>
+            <w:shd w:val="clear" w:color="auto" w:fill="004E9A"/>
+          </w:tcPr>
+          <w:p>
+            <w:r>
+              <w:rPr>
+                <w:b/>
+                <w:color w:val="FFFFFF"/>
+                <w:sz w:val="18"/>
+              </w:rPr>
+              <w:t>Procedure</w:t>
+            </w:r>
+          </w:p>
+        </w:tc>
+        <w:tc>
+          <w:tcPr>
+            <w:tcW w:type="dxa" w:w="3120"/>
+            <w:shd w:val="clear" w:color="auto" w:fill="004E9A"/>
+          </w:tcPr>
+          <w:p>
+            <w:r>
+              <w:rPr>
+                <w:b/>
+                <w:color w:val="FFFFFF"/>
+                <w:sz w:val="18"/>
+              </w:rPr>
+              <w:t>Resultat attendu / Preuve</w:t>
+            </w:r>
+          </w:p>
+        </w:tc>
+      </w:tr>
+      <w:tr>
+        <w:tc>
+          <w:tcPr>
+            <w:tcW w:type="dxa" w:w="3120"/>
+          </w:tcPr>
+          <w:p>
+            <w:r>
+              <w:rPr>
+                <w:sz w:val="18"/>
+              </w:rPr>
+              <w:t>T-01 — Deploiement IaC</w:t>
+            </w:r>
+          </w:p>
+        </w:tc>
+        <w:tc>
+          <w:tcPr>
+            <w:tcW w:type="dxa" w:w="3120"/>
+          </w:tcPr>
+          <w:p>
+            <w:r>
+              <w:rPr>
+                <w:sz w:val="18"/>
+              </w:rPr>
+              <w:t>Partir d'un environnement sans ressources et executer la procedure de deploiement.</w:t>
+            </w:r>
+          </w:p>
+        </w:tc>
+        <w:tc>
+          <w:tcPr>
+            <w:tcW w:type="dxa" w:w="3120"/>
+          </w:tcPr>
+          <w:p>
+            <w:r>
+              <w:rPr>
+                <w:sz w:val="18"/>
+              </w:rPr>
+              <w:t>Ressources creees par Terraform, application accessible, duree enregistree.</w:t>
+            </w:r>
+          </w:p>
+        </w:tc>
+      </w:tr>
+      <w:tr>
+        <w:tc>
+          <w:tcPr>
+            <w:tcW w:type="dxa" w:w="3120"/>
+            <w:shd w:val="clear" w:color="auto" w:fill="EAF0FB"/>
+          </w:tcPr>
+          <w:p>
+            <w:r>
+              <w:rPr>
+                <w:sz w:val="18"/>
+              </w:rPr>
+              <w:t>T-02 — Controle de sante</w:t>
+            </w:r>
+          </w:p>
+        </w:tc>
+        <w:tc>
+          <w:tcPr>
+            <w:tcW w:type="dxa" w:w="3120"/>
+            <w:shd w:val="clear" w:color="auto" w:fill="EAF0FB"/>
+          </w:tcPr>
+          <w:p>
+            <w:r>
+              <w:rPr>
+                <w:sz w:val="18"/>
+              </w:rPr>
+              <w:t>Consulter le Target Group et appeler /health.</w:t>
+            </w:r>
+          </w:p>
+        </w:tc>
+        <w:tc>
+          <w:tcPr>
+            <w:tcW w:type="dxa" w:w="3120"/>
+            <w:shd w:val="clear" w:color="auto" w:fill="EAF0FB"/>
+          </w:tcPr>
+          <w:p>
+            <w:r>
+              <w:rPr>
+                <w:sz w:val="18"/>
+              </w:rPr>
+              <w:t>Cible saine enregistree ; reponse compatible avec le controle ALB.</w:t>
+            </w:r>
+          </w:p>
+        </w:tc>
+      </w:tr>
+      <w:tr>
+        <w:tc>
+          <w:tcPr>
+            <w:tcW w:type="dxa" w:w="3120"/>
+          </w:tcPr>
+          <w:p>
+            <w:r>
+              <w:rPr>
+                <w:sz w:val="18"/>
+              </w:rPr>
+              <w:t>T-03 — Segmentation</w:t>
+            </w:r>
+          </w:p>
+        </w:tc>
+        <w:tc>
+          <w:tcPr>
+            <w:tcW w:type="dxa" w:w="3120"/>
+          </w:tcPr>
+          <w:p>
+            <w:r>
+              <w:rPr>
+                <w:sz w:val="18"/>
+              </w:rPr>
+              <w:t>Verifier les regles des Security Groups et tester l'acces a RDS depuis Internet.</w:t>
+            </w:r>
+          </w:p>
+        </w:tc>
+        <w:tc>
+          <w:tcPr>
+            <w:tcW w:type="dxa" w:w="3120"/>
+          </w:tcPr>
+          <w:p>
+            <w:r>
+              <w:rPr>
+                <w:sz w:val="18"/>
+              </w:rPr>
+              <w:t>ALB accessible port 80 ; acces direct a RDS refuse depuis l'exterieur.</w:t>
+            </w:r>
+          </w:p>
+        </w:tc>
+      </w:tr>
+      <w:tr>
+        <w:tc>
+          <w:tcPr>
+            <w:tcW w:type="dxa" w:w="3120"/>
+            <w:shd w:val="clear" w:color="auto" w:fill="EAF0FB"/>
+          </w:tcPr>
+          <w:p>
+            <w:r>
+              <w:rPr>
+                <w:sz w:val="18"/>
+              </w:rPr>
+              <w:t>T-04 — Perte d'instance</w:t>
+            </w:r>
+          </w:p>
+        </w:tc>
+        <w:tc>
+          <w:tcPr>
+            <w:tcW w:type="dxa" w:w="3120"/>
+            <w:shd w:val="clear" w:color="auto" w:fill="EAF0FB"/>
+          </w:tcPr>
+          <w:p>
+            <w:r>
+              <w:rPr>
+                <w:sz w:val="18"/>
+              </w:rPr>
+              <w:t>Terminer une instance geree par l'ASG pendant un flux de requetes continu.</w:t>
+            </w:r>
+          </w:p>
+        </w:tc>
+        <w:tc>
+          <w:tcPr>
+            <w:tcW w:type="dxa" w:w="3120"/>
+            <w:shd w:val="clear" w:color="auto" w:fill="EAF0FB"/>
+          </w:tcPr>
+          <w:p>
+            <w:r>
+              <w:rPr>
+                <w:sz w:val="18"/>
+              </w:rPr>
+              <w:t>ALB continue a servir les cibles saines ; ASG remplace l'instance ; erreurs nulles.</w:t>
+            </w:r>
+          </w:p>
+        </w:tc>
+      </w:tr>
+      <w:tr>
+        <w:tc>
+          <w:tcPr>
+            <w:tcW w:type="dxa" w:w="3120"/>
+          </w:tcPr>
+          <w:p>
+            <w:r>
+              <w:rPr>
+                <w:sz w:val="18"/>
+              </w:rPr>
+              <w:t>T-05 — Charge</w:t>
+            </w:r>
+          </w:p>
+        </w:tc>
+        <w:tc>
+          <w:tcPr>
+            <w:tcW w:type="dxa" w:w="3120"/>
+          </w:tcPr>
+          <w:p>
+            <w:r>
+              <w:rPr>
+                <w:sz w:val="18"/>
+              </w:rPr>
+              <w:t>Executer le test avec 20 puis jusqu'a 100 utilisateurs simultanes.</w:t>
+            </w:r>
+          </w:p>
+        </w:tc>
+        <w:tc>
+          <w:tcPr>
+            <w:tcW w:type="dxa" w:w="3120"/>
+          </w:tcPr>
+          <w:p>
+            <w:r>
+              <w:rPr>
+                <w:sz w:val="18"/>
+              </w:rPr>
+              <w:t>Rapport : commande, duree, taux d'erreurs, latences, metriques CloudWatch.</w:t>
+            </w:r>
+          </w:p>
+        </w:tc>
+      </w:tr>
+      <w:tr>
+        <w:tc>
+          <w:tcPr>
+            <w:tcW w:type="dxa" w:w="3120"/>
+            <w:shd w:val="clear" w:color="auto" w:fill="EAF0FB"/>
+          </w:tcPr>
+          <w:p>
+            <w:r>
+              <w:rPr>
+                <w:sz w:val="18"/>
+              </w:rPr>
+              <w:t>T-06 — Sauvegarde et restauration</w:t>
+            </w:r>
+          </w:p>
+        </w:tc>
+        <w:tc>
+          <w:tcPr>
+            <w:tcW w:type="dxa" w:w="3120"/>
+            <w:shd w:val="clear" w:color="auto" w:fill="EAF0FB"/>
+          </w:tcPr>
+          <w:p>
+            <w:r>
+              <w:rPr>
+                <w:sz w:val="18"/>
+              </w:rPr>
+              <w:t>Creer ou identifier une sauvegarde, restaurer selon la procedure retenue.</w:t>
+            </w:r>
+          </w:p>
+        </w:tc>
+        <w:tc>
+          <w:tcPr>
+            <w:tcW w:type="dxa" w:w="3120"/>
+            <w:shd w:val="clear" w:color="auto" w:fill="EAF0FB"/>
+          </w:tcPr>
+          <w:p>
+            <w:r>
+              <w:rPr>
+                <w:sz w:val="18"/>
+              </w:rPr>
+              <w:t>Restauration verifiee et RTO constate consigne.</w:t>
+            </w:r>
+          </w:p>
+        </w:tc>
+      </w:tr>
+      <w:tr>
+        <w:tc>
+          <w:tcPr>
+            <w:tcW w:type="dxa" w:w="3120"/>
+          </w:tcPr>
+          <w:p>
+            <w:r>
+              <w:rPr>
+                <w:sz w:val="18"/>
+              </w:rPr>
+              <w:t>T-07 — Alarmes</w:t>
+            </w:r>
+          </w:p>
+        </w:tc>
+        <w:tc>
+          <w:tcPr>
+            <w:tcW w:type="dxa" w:w="3120"/>
+          </w:tcPr>
+          <w:p>
+            <w:r>
+              <w:rPr>
+                <w:sz w:val="18"/>
+              </w:rPr>
+              <w:t>Declencher chaque alarme de maniere controlee (ex: arreter une instance).</w:t>
+            </w:r>
+          </w:p>
+        </w:tc>
+        <w:tc>
+          <w:tcPr>
+            <w:tcW w:type="dxa" w:w="3120"/>
+          </w:tcPr>
+          <w:p>
+            <w:r>
+              <w:rPr>
+                <w:sz w:val="18"/>
+              </w:rPr>
+              <w:t>Seuil, transition d'etat, notification et retour a l'etat normal consignes.</w:t>
+            </w:r>
+          </w:p>
+        </w:tc>
+      </w:tr>
+      <w:tr>
+        <w:tc>
+          <w:tcPr>
+            <w:tcW w:type="dxa" w:w="3120"/>
+            <w:shd w:val="clear" w:color="auto" w:fill="EAF0FB"/>
+          </w:tcPr>
+          <w:p>
+            <w:r>
+              <w:rPr>
+                <w:sz w:val="18"/>
+              </w:rPr>
+              <w:t>T-08 — Mise a jour</w:t>
+            </w:r>
+          </w:p>
+        </w:tc>
+        <w:tc>
+          <w:tcPr>
+            <w:tcW w:type="dxa" w:w="3120"/>
+            <w:shd w:val="clear" w:color="auto" w:fill="EAF0FB"/>
+          </w:tcPr>
+          <w:p>
+            <w:r>
+              <w:rPr>
+                <w:sz w:val="18"/>
+              </w:rPr>
+              <w:t>Publier une version applicative via le script prevu.</w:t>
+            </w:r>
+          </w:p>
+        </w:tc>
+        <w:tc>
+          <w:tcPr>
+            <w:tcW w:type="dxa" w:w="3120"/>
+            <w:shd w:val="clear" w:color="auto" w:fill="EAF0FB"/>
+          </w:tcPr>
+          <w:p>
+            <w:r>
+              <w:rPr>
+                <w:sz w:val="18"/>
+              </w:rPr>
+              <w:t>Version attendue en service ; absence d'interruption totale observee.</w:t>
+            </w:r>
+          </w:p>
+        </w:tc>
+      </w:tr>
+      <w:tr>
+        <w:tc>
+          <w:tcPr>
+            <w:tcW w:type="dxa" w:w="3120"/>
+          </w:tcPr>
+          <w:p>
+            <w:r>
+              <w:rPr>
+                <w:sz w:val="18"/>
+              </w:rPr>
+              <w:t>T-09 — Destruction</w:t>
+            </w:r>
+          </w:p>
+        </w:tc>
+        <w:tc>
+          <w:tcPr>
+            <w:tcW w:type="dxa" w:w="3120"/>
+          </w:tcPr>
+          <w:p>
+            <w:r>
+              <w:rPr>
+                <w:sz w:val="18"/>
+              </w:rPr>
+              <w:t>Executer le script de destruction puis verifier l'inventaire des ressources.</w:t>
+            </w:r>
+          </w:p>
+        </w:tc>
+        <w:tc>
+          <w:tcPr>
+            <w:tcW w:type="dxa" w:w="3120"/>
+          </w:tcPr>
+          <w:p>
+            <w:r>
+              <w:rPr>
+                <w:sz w:val="18"/>
+              </w:rPr>
+              <w:t>Ressources facturees a l'heure supprimees ; exceptions documentees.</w:t>
+            </w:r>
+          </w:p>
+        </w:tc>
+      </w:tr>
+      <w:tr>
+        <w:tc>
+          <w:tcPr>
+            <w:tcW w:type="dxa" w:w="3120"/>
+            <w:shd w:val="clear" w:color="auto" w:fill="EAF0FB"/>
+          </w:tcPr>
+          <w:p>
+            <w:r>
+              <w:rPr>
+                <w:sz w:val="18"/>
+              </w:rPr>
+              <w:t>T-10 — Reconstruction</w:t>
+            </w:r>
+          </w:p>
+        </w:tc>
+        <w:tc>
+          <w:tcPr>
+            <w:tcW w:type="dxa" w:w="3120"/>
+            <w:shd w:val="clear" w:color="auto" w:fill="EAF0FB"/>
+          </w:tcPr>
+          <w:p>
+            <w:r>
+              <w:rPr>
+                <w:sz w:val="18"/>
+              </w:rPr>
+              <w:t>Apres T-09, redeployer depuis le depot.</w:t>
+            </w:r>
+          </w:p>
+        </w:tc>
+        <w:tc>
+          <w:tcPr>
+            <w:tcW w:type="dxa" w:w="3120"/>
+            <w:shd w:val="clear" w:color="auto" w:fill="EAF0FB"/>
+          </w:tcPr>
+          <w:p>
+            <w:r>
+              <w:rPr>
+                <w:sz w:val="18"/>
+              </w:rPr>
+              <w:t>Service de nouveau accessible ; duree comparee a l'objectif (mesure : 3m26s).</w:t>
+            </w:r>
+          </w:p>
+        </w:tc>
+      </w:tr>
+    </w:tbl>
+    <w:p/>
+    <w:p>
+      <w:pPr>
+        <w:pStyle w:val="Heading1"/>
+        <w:spacing w:before="360" w:after="120"/>
+      </w:pPr>
+      <w:r>
+        <w:rPr>
+          <w:color w:val="004E9A"/>
+          <w:sz w:val="32"/>
+        </w:rPr>
+        <w:t>ANNEXE E — Livrables et Calendrier (14 semaines)</w:t>
+      </w:r>
+    </w:p>
+    <w:tbl>
+      <w:tblPr>
+        <w:tblStyle w:val="TableGrid"/>
+        <w:tblW w:type="auto" w:w="0"/>
+        <w:tblLook w:firstColumn="1" w:firstRow="1" w:lastColumn="0" w:lastRow="0" w:noHBand="0" w:noVBand="1" w:val="04A0"/>
+      </w:tblPr>
+      <w:tblGrid>
+        <w:gridCol w:w="3120"/>
+        <w:gridCol w:w="3120"/>
+        <w:gridCol w:w="3120"/>
+      </w:tblGrid>
+      <w:tr>
+        <w:tc>
+          <w:tcPr>
+            <w:tcW w:type="dxa" w:w="3120"/>
+            <w:shd w:val="clear" w:color="auto" w:fill="004E9A"/>
+          </w:tcPr>
+          <w:p>
+            <w:r>
+              <w:rPr>
+                <w:b/>
+                <w:color w:val="FFFFFF"/>
+                <w:sz w:val="18"/>
+              </w:rPr>
+              <w:t>Livrable</w:t>
+            </w:r>
+          </w:p>
+        </w:tc>
+        <w:tc>
+          <w:tcPr>
+            <w:tcW w:type="dxa" w:w="3120"/>
+            <w:shd w:val="clear" w:color="auto" w:fill="004E9A"/>
+          </w:tcPr>
+          <w:p>
+            <w:r>
+              <w:rPr>
+                <w:b/>
+                <w:color w:val="FFFFFF"/>
+                <w:sz w:val="18"/>
+              </w:rPr>
+              <w:t>Semaines</w:t>
+            </w:r>
+          </w:p>
+        </w:tc>
+        <w:tc>
+          <w:tcPr>
+            <w:tcW w:type="dxa" w:w="3120"/>
+            <w:shd w:val="clear" w:color="auto" w:fill="004E9A"/>
+          </w:tcPr>
+          <w:p>
+            <w:r>
+              <w:rPr>
+                <w:b/>
+                <w:color w:val="FFFFFF"/>
+                <w:sz w:val="18"/>
+              </w:rPr>
+              <w:t>Contenu attendu</w:t>
+            </w:r>
+          </w:p>
+        </w:tc>
+      </w:tr>
+      <w:tr>
+        <w:tc>
+          <w:tcPr>
+            <w:tcW w:type="dxa" w:w="3120"/>
+          </w:tcPr>
+          <w:p>
+            <w:r>
+              <w:rPr>
+                <w:sz w:val="18"/>
+              </w:rPr>
+              <w:t>L1 — Sujet et exigences</w:t>
+            </w:r>
+          </w:p>
+        </w:tc>
+        <w:tc>
+          <w:tcPr>
+            <w:tcW w:type="dxa" w:w="3120"/>
+          </w:tcPr>
+          <w:p>
+            <w:r>
+              <w:rPr>
+                <w:sz w:val="18"/>
+              </w:rPr>
+              <w:t>1-2</w:t>
+            </w:r>
+          </w:p>
+        </w:tc>
+        <w:tc>
+          <w:tcPr>
+            <w:tcW w:type="dxa" w:w="3120"/>
+          </w:tcPr>
+          <w:p>
+            <w:r>
+              <w:rPr>
+                <w:sz w:val="18"/>
+              </w:rPr>
+              <w:t>Sujet, application, membres, objectifs mesurables, risques initiaux et cahier des charges.</w:t>
+            </w:r>
+          </w:p>
+        </w:tc>
+      </w:tr>
+      <w:tr>
+        <w:tc>
+          <w:tcPr>
+            <w:tcW w:type="dxa" w:w="3120"/>
+            <w:shd w:val="clear" w:color="auto" w:fill="EAF0FB"/>
+          </w:tcPr>
+          <w:p>
+            <w:r>
+              <w:rPr>
+                <w:sz w:val="18"/>
+              </w:rPr>
+              <w:t>L2 — Architecture et budget</w:t>
+            </w:r>
+          </w:p>
+        </w:tc>
+        <w:tc>
+          <w:tcPr>
+            <w:tcW w:type="dxa" w:w="3120"/>
+            <w:shd w:val="clear" w:color="auto" w:fill="EAF0FB"/>
+          </w:tcPr>
+          <w:p>
+            <w:r>
+              <w:rPr>
+                <w:sz w:val="18"/>
+              </w:rPr>
+              <w:t>3-4</w:t>
+            </w:r>
+          </w:p>
+        </w:tc>
+        <w:tc>
+          <w:tcPr>
+            <w:tcW w:type="dxa" w:w="3120"/>
+            <w:shd w:val="clear" w:color="auto" w:fill="EAF0FB"/>
+          </w:tcPr>
+          <w:p>
+            <w:r>
+              <w:rPr>
+                <w:sz w:val="18"/>
+              </w:rPr>
+              <w:t>Architecture detaillee, services justifies selon 5 axes, decisions, estimation de cout.</w:t>
+            </w:r>
+          </w:p>
+        </w:tc>
+      </w:tr>
+      <w:tr>
+        <w:tc>
+          <w:tcPr>
+            <w:tcW w:type="dxa" w:w="3120"/>
+          </w:tcPr>
+          <w:p>
+            <w:r>
+              <w:rPr>
+                <w:sz w:val="18"/>
+              </w:rPr>
+              <w:t>L3 — Reseau et calcul</w:t>
+            </w:r>
+          </w:p>
+        </w:tc>
+        <w:tc>
+          <w:tcPr>
+            <w:tcW w:type="dxa" w:w="3120"/>
+          </w:tcPr>
+          <w:p>
+            <w:r>
+              <w:rPr>
+                <w:sz w:val="18"/>
+              </w:rPr>
+              <w:t>5-6</w:t>
+            </w:r>
+          </w:p>
+        </w:tc>
+        <w:tc>
+          <w:tcPr>
+            <w:tcW w:type="dxa" w:w="3120"/>
+          </w:tcPr>
+          <w:p>
+            <w:r>
+              <w:rPr>
+                <w:sz w:val="18"/>
+              </w:rPr>
+              <w:t>VPC, sous-reseaux multi-AZ, routage, securite, EC2 initiale, Terraform IaC, demo live.</w:t>
+            </w:r>
+          </w:p>
+        </w:tc>
+      </w:tr>
+      <w:tr>
+        <w:tc>
+          <w:tcPr>
+            <w:tcW w:type="dxa" w:w="3120"/>
+            <w:shd w:val="clear" w:color="auto" w:fill="EAF0FB"/>
+          </w:tcPr>
+          <w:p>
+            <w:r>
+              <w:rPr>
+                <w:sz w:val="18"/>
+              </w:rPr>
+              <w:t>L4 — Haute disponibilite</w:t>
+            </w:r>
+          </w:p>
+        </w:tc>
+        <w:tc>
+          <w:tcPr>
+            <w:tcW w:type="dxa" w:w="3120"/>
+            <w:shd w:val="clear" w:color="auto" w:fill="EAF0FB"/>
+          </w:tcPr>
+          <w:p>
+            <w:r>
+              <w:rPr>
+                <w:sz w:val="18"/>
+              </w:rPr>
+              <w:t>7-8</w:t>
+            </w:r>
+          </w:p>
+        </w:tc>
+        <w:tc>
+          <w:tcPr>
+            <w:tcW w:type="dxa" w:w="3120"/>
+            <w:shd w:val="clear" w:color="auto" w:fill="EAF0FB"/>
+          </w:tcPr>
+          <w:p>
+            <w:r>
+              <w:rPr>
+                <w:sz w:val="18"/>
+              </w:rPr>
+              <w:t>ALB, health check, Launch Template, ASG multi-AZ, application accessible et resiliente.</w:t>
+            </w:r>
+          </w:p>
+        </w:tc>
+      </w:tr>
+      <w:tr>
+        <w:tc>
+          <w:tcPr>
+            <w:tcW w:type="dxa" w:w="3120"/>
+          </w:tcPr>
+          <w:p>
+            <w:r>
+              <w:rPr>
+                <w:sz w:val="18"/>
+              </w:rPr>
+              <w:t>L5 — Donnees et sauvegarde</w:t>
+            </w:r>
+          </w:p>
+        </w:tc>
+        <w:tc>
+          <w:tcPr>
+            <w:tcW w:type="dxa" w:w="3120"/>
+          </w:tcPr>
+          <w:p>
+            <w:r>
+              <w:rPr>
+                <w:sz w:val="18"/>
+              </w:rPr>
+              <w:t>9-10</w:t>
+            </w:r>
+          </w:p>
+        </w:tc>
+        <w:tc>
+          <w:tcPr>
+            <w:tcW w:type="dxa" w:w="3120"/>
+          </w:tcPr>
+          <w:p>
+            <w:r>
+              <w:rPr>
+                <w:sz w:val="18"/>
+              </w:rPr>
+              <w:t>RDS prive, S3, sauvegarde, restauration et reconstruction complete mesuree.</w:t>
+            </w:r>
+          </w:p>
+        </w:tc>
+      </w:tr>
+      <w:tr>
+        <w:tc>
+          <w:tcPr>
+            <w:tcW w:type="dxa" w:w="3120"/>
+            <w:shd w:val="clear" w:color="auto" w:fill="EAF0FB"/>
+          </w:tcPr>
+          <w:p>
+            <w:r>
+              <w:rPr>
+                <w:sz w:val="18"/>
+              </w:rPr>
+              <w:t>L6 — Supervision, securite, cout</w:t>
+            </w:r>
+          </w:p>
+        </w:tc>
+        <w:tc>
+          <w:tcPr>
+            <w:tcW w:type="dxa" w:w="3120"/>
+            <w:shd w:val="clear" w:color="auto" w:fill="EAF0FB"/>
+          </w:tcPr>
+          <w:p>
+            <w:r>
+              <w:rPr>
+                <w:sz w:val="18"/>
+              </w:rPr>
+              <w:t>11-12</w:t>
+            </w:r>
+          </w:p>
+        </w:tc>
+        <w:tc>
+          <w:tcPr>
+            <w:tcW w:type="dxa" w:w="3120"/>
+            <w:shd w:val="clear" w:color="auto" w:fill="EAF0FB"/>
+          </w:tcPr>
+          <w:p>
+            <w:r>
+              <w:rPr>
+                <w:sz w:val="18"/>
+              </w:rPr>
+              <w:t>Journaux, tableau de bord, deux alarmes, secrets, audit reseau et optimisation budgetaire.</w:t>
+            </w:r>
+          </w:p>
+        </w:tc>
+      </w:tr>
+      <w:tr>
+        <w:tc>
+          <w:tcPr>
+            <w:tcW w:type="dxa" w:w="3120"/>
+          </w:tcPr>
+          <w:p>
+            <w:r>
+              <w:rPr>
+                <w:sz w:val="18"/>
+              </w:rPr>
+              <w:t>L7 — Exploitation et soutenance</w:t>
+            </w:r>
+          </w:p>
+        </w:tc>
+        <w:tc>
+          <w:tcPr>
+            <w:tcW w:type="dxa" w:w="3120"/>
+          </w:tcPr>
+          <w:p>
+            <w:r>
+              <w:rPr>
+                <w:sz w:val="18"/>
+              </w:rPr>
+              <w:t>13-14</w:t>
+            </w:r>
+          </w:p>
+        </w:tc>
+        <w:tc>
+          <w:tcPr>
+            <w:tcW w:type="dxa" w:w="3120"/>
+          </w:tcPr>
+          <w:p>
+            <w:r>
+              <w:rPr>
+                <w:sz w:val="18"/>
+              </w:rPr>
+              <w:t>Test de charge, exercice d'incident, rapport, documentation finale, demonstration.</w:t>
+            </w:r>
+          </w:p>
+        </w:tc>
+      </w:tr>
+    </w:tbl>
+    <w:p/>
+    <w:p>
+      <w:pPr>
+        <w:pStyle w:val="Heading1"/>
+        <w:spacing w:before="360" w:after="120"/>
+      </w:pPr>
+      <w:r>
+        <w:rPr>
+          <w:color w:val="004E9A"/>
+          <w:sz w:val="32"/>
+        </w:rPr>
+        <w:t>ANNEXE F — Organisation de l'Equipe</w:t>
+      </w:r>
+    </w:p>
+    <w:p>
+      <w:pPr>
+        <w:spacing w:after="80"/>
+      </w:pPr>
+      <w:r>
+        <w:rPr>
+          <w:sz w:val="22"/>
+        </w:rPr>
+        <w:t>Chaque membre participe a la revue du code, aux demonstrations et a la comprehension de l'ensemble de l'architecture.</w:t>
+      </w:r>
+    </w:p>
+    <w:tbl>
+      <w:tblPr>
+        <w:tblStyle w:val="TableGrid"/>
+        <w:tblW w:type="auto" w:w="0"/>
+        <w:tblLook w:firstColumn="1" w:firstRow="1" w:lastColumn="0" w:lastRow="0" w:noHBand="0" w:noVBand="1" w:val="04A0"/>
+      </w:tblPr>
+      <w:tblGrid>
+        <w:gridCol w:w="3120"/>
+        <w:gridCol w:w="3120"/>
+        <w:gridCol w:w="3120"/>
+      </w:tblGrid>
+      <w:tr>
+        <w:tc>
+          <w:tcPr>
+            <w:tcW w:type="dxa" w:w="3120"/>
+            <w:shd w:val="clear" w:color="auto" w:fill="004E9A"/>
+          </w:tcPr>
+          <w:p>
+            <w:r>
+              <w:rPr>
+                <w:b/>
+                <w:color w:val="FFFFFF"/>
+                <w:sz w:val="18"/>
+              </w:rPr>
+              <w:t>Role</w:t>
+            </w:r>
+          </w:p>
+        </w:tc>
+        <w:tc>
+          <w:tcPr>
+            <w:tcW w:type="dxa" w:w="3120"/>
+            <w:shd w:val="clear" w:color="auto" w:fill="004E9A"/>
+          </w:tcPr>
+          <w:p>
+            <w:r>
+              <w:rPr>
+                <w:b/>
+                <w:color w:val="FFFFFF"/>
+                <w:sz w:val="18"/>
+              </w:rPr>
+              <w:t>Etudiant</w:t>
+            </w:r>
+          </w:p>
+        </w:tc>
+        <w:tc>
+          <w:tcPr>
+            <w:tcW w:type="dxa" w:w="3120"/>
+            <w:shd w:val="clear" w:color="auto" w:fill="004E9A"/>
+          </w:tcPr>
+          <w:p>
+            <w:r>
+              <w:rPr>
+                <w:b/>
+                <w:color w:val="FFFFFF"/>
+                <w:sz w:val="18"/>
+              </w:rPr>
+              <w:t>Responsabilites principales</w:t>
+            </w:r>
+          </w:p>
+        </w:tc>
+      </w:tr>
+      <w:tr>
+        <w:tc>
+          <w:tcPr>
+            <w:tcW w:type="dxa" w:w="3120"/>
+          </w:tcPr>
+          <w:p>
+            <w:r>
+              <w:rPr>
+                <w:sz w:val="18"/>
+              </w:rPr>
+              <w:t>Responsable infrastructure / IaC</w:t>
+            </w:r>
+          </w:p>
+        </w:tc>
+        <w:tc>
+          <w:tcPr>
+            <w:tcW w:type="dxa" w:w="3120"/>
+          </w:tcPr>
+          <w:p>
+            <w:r>
+              <w:rPr>
+                <w:sz w:val="18"/>
+              </w:rPr>
+              <w:t>LAAMERI Mohamed</w:t>
+            </w:r>
+          </w:p>
+        </w:tc>
+        <w:tc>
+          <w:tcPr>
+            <w:tcW w:type="dxa" w:w="3120"/>
+          </w:tcPr>
+          <w:p>
+            <w:r>
+              <w:rPr>
+                <w:sz w:val="18"/>
+              </w:rPr>
+              <w:t>Modules Terraform, reseau, calcul, etat et reproductibilite.</w:t>
+            </w:r>
+          </w:p>
+        </w:tc>
+      </w:tr>
+      <w:tr>
+        <w:tc>
+          <w:tcPr>
+            <w:tcW w:type="dxa" w:w="3120"/>
+            <w:shd w:val="clear" w:color="auto" w:fill="EAF0FB"/>
+          </w:tcPr>
+          <w:p>
+            <w:r>
+              <w:rPr>
+                <w:sz w:val="18"/>
+              </w:rPr>
+              <w:t>Responsable application / deploiement</w:t>
+            </w:r>
+          </w:p>
+        </w:tc>
+        <w:tc>
+          <w:tcPr>
+            <w:tcW w:type="dxa" w:w="3120"/>
+            <w:shd w:val="clear" w:color="auto" w:fill="EAF0FB"/>
+          </w:tcPr>
+          <w:p>
+            <w:r>
+              <w:rPr>
+                <w:sz w:val="18"/>
+              </w:rPr>
+              <w:t>JEBAHI Mohamed</w:t>
+            </w:r>
+          </w:p>
+        </w:tc>
+        <w:tc>
+          <w:tcPr>
+            <w:tcW w:type="dxa" w:w="3120"/>
+            <w:shd w:val="clear" w:color="auto" w:fill="EAF0FB"/>
+          </w:tcPr>
+          <w:p>
+            <w:r>
+              <w:rPr>
+                <w:sz w:val="18"/>
+              </w:rPr>
+              <w:t>Preparation de l'artefact, configuration Node.js, publication et tests.</w:t>
+            </w:r>
+          </w:p>
+        </w:tc>
+      </w:tr>
+      <w:tr>
+        <w:tc>
+          <w:tcPr>
+            <w:tcW w:type="dxa" w:w="3120"/>
+          </w:tcPr>
+          <w:p>
+            <w:r>
+              <w:rPr>
+                <w:sz w:val="18"/>
+              </w:rPr>
+              <w:t>Responsable donnees / securite</w:t>
+            </w:r>
+          </w:p>
+        </w:tc>
+        <w:tc>
+          <w:tcPr>
+            <w:tcW w:type="dxa" w:w="3120"/>
+          </w:tcPr>
+          <w:p>
+            <w:r>
+              <w:rPr>
+                <w:sz w:val="18"/>
+              </w:rPr>
+              <w:t>KAHLA Salma</w:t>
+            </w:r>
+          </w:p>
+        </w:tc>
+        <w:tc>
+          <w:tcPr>
+            <w:tcW w:type="dxa" w:w="3120"/>
+          </w:tcPr>
+          <w:p>
+            <w:r>
+              <w:rPr>
+                <w:sz w:val="18"/>
+              </w:rPr>
+              <w:t>RDS, sauvegarde, regles reseau, secrets et controle d'acces.</w:t>
+            </w:r>
+          </w:p>
+        </w:tc>
+      </w:tr>
+      <w:tr>
+        <w:tc>
+          <w:tcPr>
+            <w:tcW w:type="dxa" w:w="3120"/>
+            <w:shd w:val="clear" w:color="auto" w:fill="EAF0FB"/>
+          </w:tcPr>
+          <w:p>
+            <w:r>
+              <w:rPr>
+                <w:sz w:val="18"/>
+              </w:rPr>
+              <w:t>Responsable supervision / exploitation</w:t>
+            </w:r>
+          </w:p>
+        </w:tc>
+        <w:tc>
+          <w:tcPr>
+            <w:tcW w:type="dxa" w:w="3120"/>
+            <w:shd w:val="clear" w:color="auto" w:fill="EAF0FB"/>
+          </w:tcPr>
+          <w:p>
+            <w:r>
+              <w:rPr>
+                <w:sz w:val="18"/>
+              </w:rPr>
+              <w:t>CHAIBI Arij</w:t>
+            </w:r>
+          </w:p>
+        </w:tc>
+        <w:tc>
+          <w:tcPr>
+            <w:tcW w:type="dxa" w:w="3120"/>
+            <w:shd w:val="clear" w:color="auto" w:fill="EAF0FB"/>
+          </w:tcPr>
+          <w:p>
+            <w:r>
+              <w:rPr>
+                <w:sz w:val="18"/>
+              </w:rPr>
+              <w:t>CloudWatch, alarmes, tests de panne, journaux et procedures.</w:t>
+            </w:r>
+          </w:p>
+        </w:tc>
+      </w:tr>
+      <w:tr>
+        <w:tc>
+          <w:tcPr>
+            <w:tcW w:type="dxa" w:w="3120"/>
+          </w:tcPr>
+          <w:p>
+            <w:r>
+              <w:rPr>
+                <w:sz w:val="18"/>
+              </w:rPr>
+              <w:t>Responsable documentation / couts</w:t>
+            </w:r>
+          </w:p>
+        </w:tc>
+        <w:tc>
+          <w:tcPr>
+            <w:tcW w:type="dxa" w:w="3120"/>
+          </w:tcPr>
+          <w:p>
+            <w:r>
+              <w:rPr>
+                <w:sz w:val="18"/>
+              </w:rPr>
+              <w:t>KHARRAT Mouheddin</w:t>
+            </w:r>
+          </w:p>
+        </w:tc>
+        <w:tc>
+          <w:tcPr>
+            <w:tcW w:type="dxa" w:w="3120"/>
+          </w:tcPr>
+          <w:p>
+            <w:r>
+              <w:rPr>
+                <w:sz w:val="18"/>
+              </w:rPr>
+              <w:t>Livrables, suivi budgetaire, compte rendu des seances et preuves.</w:t>
+            </w:r>
+          </w:p>
+        </w:tc>
+      </w:tr>
+    </w:tbl>
+    <w:p/>
+    <w:p>
+      <w:pPr>
+        <w:pStyle w:val="Heading1"/>
+        <w:spacing w:before="360" w:after="120"/>
+      </w:pPr>
+      <w:r>
+        <w:rPr>
+          <w:color w:val="004E9A"/>
+          <w:sz w:val="32"/>
+        </w:rPr>
+        <w:t>ANNEXE G — Risques et Mesures de Maitrise</w:t>
+      </w:r>
+    </w:p>
+    <w:tbl>
+      <w:tblPr>
+        <w:tblStyle w:val="TableGrid"/>
+        <w:tblW w:type="auto" w:w="0"/>
+        <w:tblLook w:firstColumn="1" w:firstRow="1" w:lastColumn="0" w:lastRow="0" w:noHBand="0" w:noVBand="1" w:val="04A0"/>
+      </w:tblPr>
+      <w:tblGrid>
+        <w:gridCol w:w="3120"/>
+        <w:gridCol w:w="3120"/>
+        <w:gridCol w:w="3120"/>
+      </w:tblGrid>
+      <w:tr>
+        <w:tc>
+          <w:tcPr>
+            <w:tcW w:type="dxa" w:w="3120"/>
+            <w:shd w:val="clear" w:color="auto" w:fill="004E9A"/>
+          </w:tcPr>
+          <w:p>
+            <w:r>
+              <w:rPr>
+                <w:b/>
+                <w:color w:val="FFFFFF"/>
+                <w:sz w:val="18"/>
+              </w:rPr>
+              <w:t>Risque</w:t>
+            </w:r>
+          </w:p>
+        </w:tc>
+        <w:tc>
+          <w:tcPr>
+            <w:tcW w:type="dxa" w:w="3120"/>
+            <w:shd w:val="clear" w:color="auto" w:fill="004E9A"/>
+          </w:tcPr>
+          <w:p>
+            <w:r>
+              <w:rPr>
+                <w:b/>
+                <w:color w:val="FFFFFF"/>
+                <w:sz w:val="18"/>
+              </w:rPr>
+              <w:t>Impact</w:t>
+            </w:r>
+          </w:p>
+        </w:tc>
+        <w:tc>
+          <w:tcPr>
+            <w:tcW w:type="dxa" w:w="3120"/>
+            <w:shd w:val="clear" w:color="auto" w:fill="004E9A"/>
+          </w:tcPr>
+          <w:p>
+            <w:r>
+              <w:rPr>
+                <w:b/>
+                <w:color w:val="FFFFFF"/>
+                <w:sz w:val="18"/>
+              </w:rPr>
+              <w:t>Mesure de maitrise</w:t>
+            </w:r>
+          </w:p>
+        </w:tc>
+      </w:tr>
+      <w:tr>
+        <w:tc>
+          <w:tcPr>
+            <w:tcW w:type="dxa" w:w="3120"/>
+          </w:tcPr>
+          <w:p>
+            <w:r>
+              <w:rPr>
+                <w:sz w:val="18"/>
+              </w:rPr>
+              <w:t>Epuisement du credit AWS</w:t>
+            </w:r>
+          </w:p>
+        </w:tc>
+        <w:tc>
+          <w:tcPr>
+            <w:tcW w:type="dxa" w:w="3120"/>
+          </w:tcPr>
+          <w:p>
+            <w:r>
+              <w:rPr>
+                <w:sz w:val="18"/>
+              </w:rPr>
+              <w:t>Perte de l'environnement, impossibilite de poursuivre les essais.</w:t>
+            </w:r>
+          </w:p>
+        </w:tc>
+        <w:tc>
+          <w:tcPr>
+            <w:tcW w:type="dxa" w:w="3120"/>
+          </w:tcPr>
+          <w:p>
+            <w:r>
+              <w:rPr>
+                <w:sz w:val="18"/>
+              </w:rPr>
+              <w:t>Detruire les ressources horaires apres chaque seance, controle des couts regulier.</w:t>
+            </w:r>
+          </w:p>
+        </w:tc>
+      </w:tr>
+      <w:tr>
+        <w:tc>
+          <w:tcPr>
+            <w:tcW w:type="dxa" w:w="3120"/>
+            <w:shd w:val="clear" w:color="auto" w:fill="EAF0FB"/>
+          </w:tcPr>
+          <w:p>
+            <w:r>
+              <w:rPr>
+                <w:sz w:val="18"/>
+              </w:rPr>
+              <w:t>Expiration des identifiants temporaires STS</w:t>
+            </w:r>
+          </w:p>
+        </w:tc>
+        <w:tc>
+          <w:tcPr>
+            <w:tcW w:type="dxa" w:w="3120"/>
+            <w:shd w:val="clear" w:color="auto" w:fill="EAF0FB"/>
+          </w:tcPr>
+          <w:p>
+            <w:r>
+              <w:rPr>
+                <w:sz w:val="18"/>
+              </w:rPr>
+              <w:t>Echec des commandes Terraform ou des scripts (erreur 403).</w:t>
+            </w:r>
+          </w:p>
+        </w:tc>
+        <w:tc>
+          <w:tcPr>
+            <w:tcW w:type="dxa" w:w="3120"/>
+            <w:shd w:val="clear" w:color="auto" w:fill="EAF0FB"/>
+          </w:tcPr>
+          <w:p>
+            <w:r>
+              <w:rPr>
+                <w:sz w:val="18"/>
+              </w:rPr>
+              <w:t>Procedure de rechargement documentee (Start Lab &gt; AWS Details &gt; Show &gt; copier dans ~/.aws/credentials).</w:t>
+            </w:r>
+          </w:p>
+        </w:tc>
+      </w:tr>
+      <w:tr>
+        <w:tc>
+          <w:tcPr>
+            <w:tcW w:type="dxa" w:w="3120"/>
+          </w:tcPr>
+          <w:p>
+            <w:r>
+              <w:rPr>
+                <w:sz w:val="18"/>
+              </w:rPr>
+              <w:t>Permissions IAM Learner Lab insuffisantes</w:t>
+            </w:r>
+          </w:p>
+        </w:tc>
+        <w:tc>
+          <w:tcPr>
+            <w:tcW w:type="dxa" w:w="3120"/>
+          </w:tcPr>
+          <w:p>
+            <w:r>
+              <w:rPr>
+                <w:sz w:val="18"/>
+              </w:rPr>
+              <w:t>Deploiement partiel ou service indisponible.</w:t>
+            </w:r>
+          </w:p>
+        </w:tc>
+        <w:tc>
+          <w:tcPr>
+            <w:tcW w:type="dxa" w:w="3120"/>
+          </w:tcPr>
+          <w:p>
+            <w:r>
+              <w:rPr>
+                <w:sz w:val="18"/>
+              </w:rPr>
+              <w:t>Verification precoce des actions autorisees ; repli justifie documente.</w:t>
+            </w:r>
+          </w:p>
+        </w:tc>
+      </w:tr>
+      <w:tr>
+        <w:tc>
+          <w:tcPr>
+            <w:tcW w:type="dxa" w:w="3120"/>
+            <w:shd w:val="clear" w:color="auto" w:fill="EAF0FB"/>
+          </w:tcPr>
+          <w:p>
+            <w:r>
+              <w:rPr>
+                <w:sz w:val="18"/>
+              </w:rPr>
+              <w:t>Cout ou quotas depasses (ALB, RDS, NAT)</w:t>
+            </w:r>
+          </w:p>
+        </w:tc>
+        <w:tc>
+          <w:tcPr>
+            <w:tcW w:type="dxa" w:w="3120"/>
+            <w:shd w:val="clear" w:color="auto" w:fill="EAF0FB"/>
+          </w:tcPr>
+          <w:p>
+            <w:r>
+              <w:rPr>
+                <w:sz w:val="18"/>
+              </w:rPr>
+              <w:t>Depassement du budget de 50 USD.</w:t>
+            </w:r>
+          </w:p>
+        </w:tc>
+        <w:tc>
+          <w:tcPr>
+            <w:tcW w:type="dxa" w:w="3120"/>
+            <w:shd w:val="clear" w:color="auto" w:fill="EAF0FB"/>
+          </w:tcPr>
+          <w:p>
+            <w:r>
+              <w:rPr>
+                <w:sz w:val="18"/>
+              </w:rPr>
+              <w:t>Deploiement uniquement pendant les seances, estimation prealable obligatoire.</w:t>
+            </w:r>
+          </w:p>
+        </w:tc>
+      </w:tr>
+      <w:tr>
+        <w:tc>
+          <w:tcPr>
+            <w:tcW w:type="dxa" w:w="3120"/>
+          </w:tcPr>
+          <w:p>
+            <w:r>
+              <w:rPr>
+                <w:sz w:val="18"/>
+              </w:rPr>
+              <w:t>Perte de l'etat Terraform (.tfstate)</w:t>
+            </w:r>
+          </w:p>
+        </w:tc>
+        <w:tc>
+          <w:tcPr>
+            <w:tcW w:type="dxa" w:w="3120"/>
+          </w:tcPr>
+          <w:p>
+            <w:r>
+              <w:rPr>
+                <w:sz w:val="18"/>
+              </w:rPr>
+              <w:t>Etat incoherent, ressources orphelines continuant de facturer.</w:t>
+            </w:r>
+          </w:p>
+        </w:tc>
+        <w:tc>
+          <w:tcPr>
+            <w:tcW w:type="dxa" w:w="3120"/>
+          </w:tcPr>
+          <w:p>
+            <w:r>
+              <w:rPr>
+                <w:sz w:val="18"/>
+              </w:rPr>
+              <w:t>Ne jamais commiter le .tfstate ; procedure de sauvegarde/restauration documentee.</w:t>
+            </w:r>
+          </w:p>
+        </w:tc>
+      </w:tr>
+      <w:tr>
+        <w:tc>
+          <w:tcPr>
+            <w:tcW w:type="dxa" w:w="3120"/>
+            <w:shd w:val="clear" w:color="auto" w:fill="EAF0FB"/>
+          </w:tcPr>
+          <w:p>
+            <w:r>
+              <w:rPr>
+                <w:sz w:val="18"/>
+              </w:rPr>
+              <w:t>Secret expose dans Git, User Data ou logs</w:t>
+            </w:r>
+          </w:p>
+        </w:tc>
+        <w:tc>
+          <w:tcPr>
+            <w:tcW w:type="dxa" w:w="3120"/>
+            <w:shd w:val="clear" w:color="auto" w:fill="EAF0FB"/>
+          </w:tcPr>
+          <w:p>
+            <w:r>
+              <w:rPr>
+                <w:sz w:val="18"/>
+              </w:rPr>
+              <w:t>Compromission des ressources et donnees.</w:t>
+            </w:r>
+          </w:p>
+        </w:tc>
+        <w:tc>
+          <w:tcPr>
+            <w:tcW w:type="dxa" w:w="3120"/>
+            <w:shd w:val="clear" w:color="auto" w:fill="EAF0FB"/>
+          </w:tcPr>
+          <w:p>
+            <w:r>
+              <w:rPr>
+                <w:sz w:val="18"/>
+              </w:rPr>
+              <w:t>Controle systematique des commits, stockage protege, rotation et suppression documentes.</w:t>
+            </w:r>
+          </w:p>
+        </w:tc>
+      </w:tr>
+      <w:tr>
+        <w:tc>
+          <w:tcPr>
+            <w:tcW w:type="dxa" w:w="3120"/>
+          </w:tcPr>
+          <w:p>
+            <w:r>
+              <w:rPr>
+                <w:sz w:val="18"/>
+              </w:rPr>
+              <w:t>Dependance externe indisponible (TMDB API)</w:t>
+            </w:r>
+          </w:p>
+        </w:tc>
+        <w:tc>
+          <w:tcPr>
+            <w:tcW w:type="dxa" w:w="3120"/>
+          </w:tcPr>
+          <w:p>
+            <w:r>
+              <w:rPr>
+                <w:sz w:val="18"/>
+              </w:rPr>
+              <w:t>Echec de demarrage de l'application.</w:t>
+            </w:r>
+          </w:p>
+        </w:tc>
+        <w:tc>
+          <w:tcPr>
+            <w:tcW w:type="dxa" w:w="3120"/>
+          </w:tcPr>
+          <w:p>
+            <w:r>
+              <w:rPr>
+                <w:sz w:val="18"/>
+              </w:rPr>
+              <w:t>Preparer les artefacts necessaires et documenter les dependances et solutions de repli.</w:t>
+            </w:r>
+          </w:p>
+        </w:tc>
+      </w:tr>
+      <w:tr>
+        <w:tc>
+          <w:tcPr>
+            <w:tcW w:type="dxa" w:w="3120"/>
+            <w:shd w:val="clear" w:color="auto" w:fill="EAF0FB"/>
+          </w:tcPr>
+          <w:p>
+            <w:r>
+              <w:rPr>
+                <w:sz w:val="18"/>
+              </w:rPr>
+              <w:t>Cibles de performance irrealistes pour t3.micro</w:t>
+            </w:r>
+          </w:p>
+        </w:tc>
+        <w:tc>
+          <w:tcPr>
+            <w:tcW w:type="dxa" w:w="3120"/>
+            <w:shd w:val="clear" w:color="auto" w:fill="EAF0FB"/>
+          </w:tcPr>
+          <w:p>
+            <w:r>
+              <w:rPr>
+                <w:sz w:val="18"/>
+              </w:rPr>
+              <w:t>Echec des seuils de charge lors des tests.</w:t>
+            </w:r>
+          </w:p>
+        </w:tc>
+        <w:tc>
+          <w:tcPr>
+            <w:tcW w:type="dxa" w:w="3120"/>
+            <w:shd w:val="clear" w:color="auto" w:fill="EAF0FB"/>
+          </w:tcPr>
+          <w:p>
+            <w:r>
+              <w:rPr>
+                <w:sz w:val="18"/>
+              </w:rPr>
+              <w:t>Mesurer progressivement, distinguer cible et resultat, expliquer les limites.</w:t>
+            </w:r>
+          </w:p>
+        </w:tc>
+      </w:tr>
+      <w:tr>
+        <w:tc>
+          <w:tcPr>
+            <w:tcW w:type="dxa" w:w="3120"/>
+          </w:tcPr>
+          <w:p>
+            <w:r>
+              <w:rPr>
+                <w:sz w:val="18"/>
+              </w:rPr>
+              <w:t>Instance NAT SPOF ou RDS Single-AZ</w:t>
+            </w:r>
+          </w:p>
+        </w:tc>
+        <w:tc>
+          <w:tcPr>
+            <w:tcW w:type="dxa" w:w="3120"/>
+          </w:tcPr>
+          <w:p>
+            <w:r>
+              <w:rPr>
+                <w:sz w:val="18"/>
+              </w:rPr>
+              <w:t>Panne pouvant interrompre une fonction (acces sortant ou donnees).</w:t>
+            </w:r>
+          </w:p>
+        </w:tc>
+        <w:tc>
+          <w:tcPr>
+            <w:tcW w:type="dxa" w:w="3120"/>
+          </w:tcPr>
+          <w:p>
+            <w:r>
+              <w:rPr>
+                <w:sz w:val="18"/>
+              </w:rPr>
+              <w:t>Documenter explicitement cette limite ; la distinguer de la resilience applicative.</w:t>
+            </w:r>
+          </w:p>
+        </w:tc>
+      </w:tr>
+    </w:tbl>
+    <w:p/>
+    <w:p>
+      <w:pPr>
+        <w:pStyle w:val="Heading1"/>
+        <w:spacing w:before="360" w:after="120"/>
+      </w:pPr>
+      <w:r>
+        <w:rPr>
+          <w:color w:val="004E9A"/>
+          <w:sz w:val="32"/>
+        </w:rPr>
+        <w:t>ANNEXE H — Limites et Decisions a Valider</w:t>
+      </w:r>
+    </w:p>
+    <w:p>
+      <w:pPr>
+        <w:pStyle w:val="ListParagraph"/>
+        <w:spacing w:after="40"/>
+        <w:ind w:left="425"/>
+      </w:pPr>
+      <w:r>
+        <w:rPr>
+          <w:sz w:val="22"/>
+        </w:rPr>
+        <w:t>1.  RDS Single-AZ retenu pour maitriser le budget (multi_az = false dans Terraform). Toute modification en Multi-AZ necessite une nouvelle estimation et l'accord de l'enseignant.</w:t>
+      </w:r>
+    </w:p>
+    <w:p>
+      <w:pPr>
+        <w:pStyle w:val="ListParagraph"/>
+        <w:spacing w:after="40"/>
+        <w:ind w:left="425"/>
+      </w:pPr>
+      <w:r>
+        <w:rPr>
+          <w:sz w:val="22"/>
+        </w:rPr>
+        <w:t>2.  Resilience globale : l'ALB et les instances applicatives couvrent deux AZs, mais l'instance NAT et RDS Single-AZ restent des points de defaillance potentiels. Le projet demontre prioritairement la tolerance a la perte d'une instance applicative, pas une disponibilite continue face a toute panne.</w:t>
+      </w:r>
+    </w:p>
+    <w:p>
+      <w:pPr>
+        <w:pStyle w:val="ListParagraph"/>
+        <w:spacing w:after="40"/>
+        <w:ind w:left="425"/>
+      </w:pPr>
+      <w:r>
+        <w:rPr>
+          <w:sz w:val="22"/>
+        </w:rPr>
+        <w:t>3.  Stockage des secrets : S3 chiffre est une solution de repli possible dans le laboratoire, mais doit etre protege par des permissions reellement applicables. Un secret dans le tfstate reste present meme si Terraform le marque sensible.</w:t>
+      </w:r>
+    </w:p>
+    <w:p>
+      <w:pPr>
+        <w:pStyle w:val="ListParagraph"/>
+        <w:spacing w:after="40"/>
+        <w:ind w:left="425"/>
+      </w:pPr>
+      <w:r>
+        <w:rPr>
+          <w:sz w:val="22"/>
+        </w:rPr>
+        <w:t>4.  IAM et SSM : l'usage de LabInstanceProfile, LabRole et SSM depend des capacites effectives du compte. Leur disponibilite doit etre verifiee des le debut.</w:t>
+      </w:r>
+    </w:p>
+    <w:p>
+      <w:pPr>
+        <w:pStyle w:val="ListParagraph"/>
+        <w:spacing w:after="40"/>
+        <w:ind w:left="425"/>
+      </w:pPr>
+      <w:r>
+        <w:rPr>
+          <w:sz w:val="22"/>
+        </w:rPr>
+        <w:t>5.  Charge : les objectifs de debit et de latence restent a confirmer par mesure ; ils ne sont pas garantis par l'architecture proposee sur t3.micro.</w:t>
+      </w:r>
+    </w:p>
+    <w:p/>
+    <w:p>
+      <w:pPr>
+        <w:pStyle w:val="Heading1"/>
+        <w:spacing w:before="360" w:after="120"/>
+      </w:pPr>
+      <w:r>
+        <w:rPr>
+          <w:color w:val="004E9A"/>
+          <w:sz w:val="32"/>
+        </w:rPr>
+        <w:t>ANNEXE I — Grille d'Evaluation Proposee</w:t>
+      </w:r>
+    </w:p>
+    <w:p>
+      <w:pPr>
+        <w:spacing w:after="80"/>
+      </w:pPr>
+      <w:r>
+        <w:rPr>
+          <w:sz w:val="22"/>
+        </w:rPr>
+        <w:t>La grille de reference du projet est la suivante (sur 100 points) :</w:t>
+      </w:r>
+    </w:p>
+    <w:tbl>
+      <w:tblPr>
+        <w:tblStyle w:val="TableGrid"/>
+        <w:tblW w:type="auto" w:w="0"/>
+        <w:tblLook w:firstColumn="1" w:firstRow="1" w:lastColumn="0" w:lastRow="0" w:noHBand="0" w:noVBand="1" w:val="04A0"/>
+      </w:tblPr>
+      <w:tblGrid>
+        <w:gridCol w:w="4680"/>
+        <w:gridCol w:w="4680"/>
+      </w:tblGrid>
+      <w:tr>
+        <w:tc>
+          <w:tcPr>
+            <w:tcW w:type="dxa" w:w="4680"/>
+            <w:shd w:val="clear" w:color="auto" w:fill="004E9A"/>
+          </w:tcPr>
+          <w:p>
+            <w:r>
+              <w:rPr>
+                <w:b/>
+                <w:color w:val="FFFFFF"/>
+                <w:sz w:val="18"/>
+              </w:rPr>
+              <w:t>Critere d'evaluation</w:t>
+            </w:r>
+          </w:p>
+        </w:tc>
+        <w:tc>
+          <w:tcPr>
+            <w:tcW w:type="dxa" w:w="4680"/>
+            <w:shd w:val="clear" w:color="auto" w:fill="004E9A"/>
+          </w:tcPr>
+          <w:p>
+            <w:r>
+              <w:rPr>
+                <w:b/>
+                <w:color w:val="FFFFFF"/>
+                <w:sz w:val="18"/>
+              </w:rPr>
+              <w:t>Ponderation</w:t>
+            </w:r>
+          </w:p>
+        </w:tc>
+      </w:tr>
+      <w:tr>
+        <w:tc>
+          <w:tcPr>
+            <w:tcW w:type="dxa" w:w="4680"/>
+          </w:tcPr>
+          <w:p>
+            <w:r>
+              <w:rPr>
+                <w:sz w:val="18"/>
+              </w:rPr>
+              <w:t>Architecture et respect des services autorises</w:t>
+            </w:r>
+          </w:p>
+        </w:tc>
+        <w:tc>
+          <w:tcPr>
+            <w:tcW w:type="dxa" w:w="4680"/>
+          </w:tcPr>
+          <w:p>
+            <w:r>
+              <w:rPr>
+                <w:sz w:val="18"/>
+              </w:rPr>
+              <w:t>20 %</w:t>
+            </w:r>
+          </w:p>
+        </w:tc>
+      </w:tr>
+      <w:tr>
+        <w:tc>
+          <w:tcPr>
+            <w:tcW w:type="dxa" w:w="4680"/>
+            <w:shd w:val="clear" w:color="auto" w:fill="EAF0FB"/>
+          </w:tcPr>
+          <w:p>
+            <w:r>
+              <w:rPr>
+                <w:sz w:val="18"/>
+              </w:rPr>
+              <w:t>Infrastructure as Code : reproductibilite, structure, qualite</w:t>
+            </w:r>
+          </w:p>
+        </w:tc>
+        <w:tc>
+          <w:tcPr>
+            <w:tcW w:type="dxa" w:w="4680"/>
+            <w:shd w:val="clear" w:color="auto" w:fill="EAF0FB"/>
+          </w:tcPr>
+          <w:p>
+            <w:r>
+              <w:rPr>
+                <w:sz w:val="18"/>
+              </w:rPr>
+              <w:t>20 %</w:t>
+            </w:r>
+          </w:p>
+        </w:tc>
+      </w:tr>
+      <w:tr>
+        <w:tc>
+          <w:tcPr>
+            <w:tcW w:type="dxa" w:w="4680"/>
+          </w:tcPr>
+          <w:p>
+            <w:r>
+              <w:rPr>
+                <w:sz w:val="18"/>
+              </w:rPr>
+              <w:t>Haute disponibilite et resilience demontree</w:t>
+            </w:r>
+          </w:p>
+        </w:tc>
+        <w:tc>
+          <w:tcPr>
+            <w:tcW w:type="dxa" w:w="4680"/>
+          </w:tcPr>
+          <w:p>
+            <w:r>
+              <w:rPr>
+                <w:sz w:val="18"/>
+              </w:rPr>
+              <w:t>15 %</w:t>
+            </w:r>
+          </w:p>
+        </w:tc>
+      </w:tr>
+      <w:tr>
+        <w:tc>
+          <w:tcPr>
+            <w:tcW w:type="dxa" w:w="4680"/>
+            <w:shd w:val="clear" w:color="auto" w:fill="EAF0FB"/>
+          </w:tcPr>
+          <w:p>
+            <w:r>
+              <w:rPr>
+                <w:sz w:val="18"/>
+              </w:rPr>
+              <w:t>Donnees, segmentation, sauvegarde et restauration</w:t>
+            </w:r>
+          </w:p>
+        </w:tc>
+        <w:tc>
+          <w:tcPr>
+            <w:tcW w:type="dxa" w:w="4680"/>
+            <w:shd w:val="clear" w:color="auto" w:fill="EAF0FB"/>
+          </w:tcPr>
+          <w:p>
+            <w:r>
+              <w:rPr>
+                <w:sz w:val="18"/>
+              </w:rPr>
+              <w:t>10 %</w:t>
+            </w:r>
+          </w:p>
+        </w:tc>
+      </w:tr>
+      <w:tr>
+        <w:tc>
+          <w:tcPr>
+            <w:tcW w:type="dxa" w:w="4680"/>
+          </w:tcPr>
+          <w:p>
+            <w:r>
+              <w:rPr>
+                <w:sz w:val="18"/>
+              </w:rPr>
+              <w:t>Securite, supervision et gestion des secrets</w:t>
+            </w:r>
+          </w:p>
+        </w:tc>
+        <w:tc>
+          <w:tcPr>
+            <w:tcW w:type="dxa" w:w="4680"/>
+          </w:tcPr>
+          <w:p>
+            <w:r>
+              <w:rPr>
+                <w:sz w:val="18"/>
+              </w:rPr>
+              <w:t>15 %</w:t>
+            </w:r>
+          </w:p>
+        </w:tc>
+      </w:tr>
+      <w:tr>
+        <w:tc>
+          <w:tcPr>
+            <w:tcW w:type="dxa" w:w="4680"/>
+            <w:shd w:val="clear" w:color="auto" w:fill="EAF0FB"/>
+          </w:tcPr>
+          <w:p>
+            <w:r>
+              <w:rPr>
+                <w:sz w:val="18"/>
+              </w:rPr>
+              <w:t>Exercice d'exploitation et rapport d'incident</w:t>
+            </w:r>
+          </w:p>
+        </w:tc>
+        <w:tc>
+          <w:tcPr>
+            <w:tcW w:type="dxa" w:w="4680"/>
+            <w:shd w:val="clear" w:color="auto" w:fill="EAF0FB"/>
+          </w:tcPr>
+          <w:p>
+            <w:r>
+              <w:rPr>
+                <w:sz w:val="18"/>
+              </w:rPr>
+              <w:t>10 %</w:t>
+            </w:r>
+          </w:p>
+        </w:tc>
+      </w:tr>
+      <w:tr>
+        <w:tc>
+          <w:tcPr>
+            <w:tcW w:type="dxa" w:w="4680"/>
+          </w:tcPr>
+          <w:p>
+            <w:r>
+              <w:rPr>
+                <w:sz w:val="18"/>
+              </w:rPr>
+              <w:t>Maitrise du cout et optimisation mesuree</w:t>
+            </w:r>
+          </w:p>
+        </w:tc>
+        <w:tc>
+          <w:tcPr>
+            <w:tcW w:type="dxa" w:w="4680"/>
+          </w:tcPr>
+          <w:p>
+            <w:r>
+              <w:rPr>
+                <w:sz w:val="18"/>
+              </w:rPr>
+              <w:t>5 %</w:t>
+            </w:r>
+          </w:p>
+        </w:tc>
+      </w:tr>
+      <w:tr>
+        <w:tc>
+          <w:tcPr>
+            <w:tcW w:type="dxa" w:w="4680"/>
+            <w:shd w:val="clear" w:color="auto" w:fill="EAF0FB"/>
+          </w:tcPr>
+          <w:p>
+            <w:r>
+              <w:rPr>
+                <w:sz w:val="18"/>
+              </w:rPr>
+              <w:t>Documentation, soutenance et justification des choix</w:t>
+            </w:r>
+          </w:p>
+        </w:tc>
+        <w:tc>
+          <w:tcPr>
+            <w:tcW w:type="dxa" w:w="4680"/>
+            <w:shd w:val="clear" w:color="auto" w:fill="EAF0FB"/>
+          </w:tcPr>
+          <w:p>
+            <w:r>
+              <w:rPr>
+                <w:sz w:val="18"/>
+              </w:rPr>
+              <w:t>3 %</w:t>
+            </w:r>
+          </w:p>
+        </w:tc>
+      </w:tr>
+      <w:tr>
+        <w:tc>
+          <w:tcPr>
+            <w:tcW w:type="dxa" w:w="4680"/>
+          </w:tcPr>
+          <w:p>
+            <w:r>
+              <w:rPr>
+                <w:sz w:val="18"/>
+              </w:rPr>
+              <w:t>Progression et repartition du travail (Git commits)</w:t>
+            </w:r>
+          </w:p>
+        </w:tc>
+        <w:tc>
+          <w:tcPr>
+            <w:tcW w:type="dxa" w:w="4680"/>
+          </w:tcPr>
+          <w:p>
+            <w:r>
+              <w:rPr>
+                <w:sz w:val="18"/>
+              </w:rPr>
+              <w:t>2 %</w:t>
+            </w:r>
+          </w:p>
+        </w:tc>
+      </w:tr>
+    </w:tbl>
+    <w:p>
+      <w:pPr>
+        <w:spacing w:after="80"/>
+      </w:pPr>
+      <w:r>
+        <w:rPr>
+          <w:sz w:val="22"/>
+        </w:rPr>
+        <w:t>Note : L'usage de Boto3 peut donner lieu au bonus annonce par l'enseignant (jusqu'a +5%) pour un outil reellement integre a l'exploitation (audit, nettoyage, test de charge ou rapport de couts). Ce bonus ne remplace pas les exigences obligatoires.</w:t>
+      </w:r>
+    </w:p>
+    <w:p/>
+    <w:p>
+      <w:pPr>
+        <w:pStyle w:val="Heading1"/>
+        <w:spacing w:before="360" w:after="120"/>
+      </w:pPr>
+      <w:r>
+        <w:rPr>
+          <w:color w:val="004E9A"/>
+          <w:sz w:val="32"/>
+        </w:rPr>
+        <w:t>ANNEXE J — Conditions de Reception Finale</w:t>
+      </w:r>
+    </w:p>
+    <w:p>
+      <w:pPr>
+        <w:spacing w:after="80"/>
+      </w:pPr>
+      <w:r>
+        <w:rPr>
+          <w:sz w:val="22"/>
+        </w:rPr>
+        <w:t>Le projet est considere comme livre lorsque :</w:t>
+      </w:r>
+    </w:p>
+    <w:p>
+      <w:pPr>
+        <w:pStyle w:val="ListParagraph"/>
+        <w:spacing w:after="40"/>
+        <w:ind w:left="425"/>
+      </w:pPr>
+      <w:r>
+        <w:rPr>
+          <w:sz w:val="22"/>
+        </w:rPr>
+        <w:t>•  L'architecture correspond au perimetre valide et les ressources sont decrites en Terraform.</w:t>
+      </w:r>
+    </w:p>
+    <w:p>
+      <w:pPr>
+        <w:pStyle w:val="ListParagraph"/>
+        <w:spacing w:after="40"/>
+        <w:ind w:left="425"/>
+      </w:pPr>
+      <w:r>
+        <w:rPr>
+          <w:sz w:val="22"/>
+        </w:rPr>
+        <w:t>•  La procedure documentee deploie l'application et la rend accessible derriere l'ALB.</w:t>
+      </w:r>
+    </w:p>
+    <w:p>
+      <w:pPr>
+        <w:pStyle w:val="ListParagraph"/>
+        <w:spacing w:after="40"/>
+        <w:ind w:left="425"/>
+      </w:pPr>
+      <w:r>
+        <w:rPr>
+          <w:sz w:val="22"/>
+        </w:rPr>
+        <w:t>•  L'ASG, le controle de sante et le comportement lors de la perte d'une instance sont demontres.</w:t>
+      </w:r>
+    </w:p>
+    <w:p>
+      <w:pPr>
+        <w:pStyle w:val="ListParagraph"/>
+        <w:spacing w:after="40"/>
+        <w:ind w:left="425"/>
+      </w:pPr>
+      <w:r>
+        <w:rPr>
+          <w:sz w:val="22"/>
+        </w:rPr>
+        <w:t>•  RDS est prive et une restauration a ete realisee (ou les limites du laboratoire sont formellement justifiees).</w:t>
+      </w:r>
+    </w:p>
+    <w:p>
+      <w:pPr>
+        <w:pStyle w:val="ListParagraph"/>
+        <w:spacing w:after="40"/>
+        <w:ind w:left="425"/>
+      </w:pPr>
+      <w:r>
+        <w:rPr>
+          <w:sz w:val="22"/>
+        </w:rPr>
+        <w:t>•  S3 est prive et utilise par le projet (artefact de deploiement).</w:t>
+      </w:r>
+    </w:p>
+    <w:p>
+      <w:pPr>
+        <w:pStyle w:val="ListParagraph"/>
+        <w:spacing w:after="40"/>
+        <w:ind w:left="425"/>
+      </w:pPr>
+      <w:r>
+        <w:rPr>
+          <w:sz w:val="22"/>
+        </w:rPr>
+        <w:t>•  Les journaux, le tableau de bord et deux alarmes ont ete verifies.</w:t>
+      </w:r>
+    </w:p>
+    <w:p>
+      <w:pPr>
+        <w:pStyle w:val="ListParagraph"/>
+        <w:spacing w:after="40"/>
+        <w:ind w:left="425"/>
+      </w:pPr>
+      <w:r>
+        <w:rPr>
+          <w:sz w:val="22"/>
+        </w:rPr>
+        <w:t>•  Les tests, mesures, incidents, couts et decisions sont consignes dans docs/.</w:t>
+      </w:r>
+    </w:p>
+    <w:p>
+      <w:pPr>
+        <w:pStyle w:val="ListParagraph"/>
+        <w:spacing w:after="40"/>
+        <w:ind w:left="425"/>
+      </w:pPr>
+      <w:r>
+        <w:rPr>
+          <w:sz w:val="22"/>
+        </w:rPr>
+        <w:t>•  Aucun secret n'est present dans le depot ou les preuves.</w:t>
+      </w:r>
+    </w:p>
+    <w:p>
+      <w:pPr>
+        <w:pStyle w:val="ListParagraph"/>
+        <w:spacing w:after="40"/>
+        <w:ind w:left="425"/>
+      </w:pPr>
+      <w:r>
+        <w:rPr>
+          <w:sz w:val="22"/>
+        </w:rPr>
+        <w:t>•  Le script de destruction a ete execute et les ressources restantes verifiees.</w:t>
+      </w:r>
+    </w:p>
+    <w:p>
+      <w:pPr>
+        <w:pStyle w:val="ListParagraph"/>
+        <w:spacing w:after="40"/>
+        <w:ind w:left="425"/>
+      </w:pPr>
+      <w:r>
+        <w:rPr>
+          <w:sz w:val="22"/>
+        </w:rPr>
+        <w:t>•  Un membre de l'equipe autre que l'auteur principal peut suivre les instructions de reconstruction.</w:t>
       </w:r>
     </w:p>
     <w:sectPr>

</xml_diff>

<commit_message>
docs(cahier-des-charges): mise a jour du document officiel avec schema d architecture et actualisation du journal
</commit_message>
<xml_diff>
--- a/docs/Cahier_des_Charges_CineTrekker.docx
+++ b/docs/Cahier_des_Charges_CineTrekker.docx
@@ -1359,50 +1359,6 @@
           <w:sz w:val="17"/>
         </w:rPr>
       </w:pPr>
-    </w:p>
-    <w:p>
-      <w:pPr>
-        <w:ind w:left="567"/>
-        <w:rPr>
-          <w:rFonts w:ascii="Courier New" w:hAnsi="Courier New"/>
-          <w:noProof/>
-          <w:sz w:val="17"/>
-        </w:rPr>
-      </w:pPr>
-    </w:p>
-    <w:p>
-      <w:pPr>
-        <w:ind w:left="567"/>
-        <w:rPr>
-          <w:rFonts w:ascii="Courier New" w:hAnsi="Courier New"/>
-          <w:noProof/>
-          <w:sz w:val="17"/>
-        </w:rPr>
-      </w:pPr>
-    </w:p>
-    <w:p>
-      <w:pPr>
-        <w:ind w:left="567"/>
-        <w:rPr>
-          <w:rFonts w:ascii="Courier New" w:hAnsi="Courier New"/>
-          <w:noProof/>
-          <w:sz w:val="17"/>
-        </w:rPr>
-      </w:pPr>
-    </w:p>
-    <w:p>
-      <w:pPr>
-        <w:ind w:left="567"/>
-        <w:jc w:val="left"/>
-        <w:rPr>
-          <w:rFonts w:ascii="Courier New" w:hAnsi="Courier New"/>
-          <w:b/>
-          <w:bCs/>
-          <w:noProof/>
-          <w:sz w:val="22"/>
-          <w:szCs w:val="22"/>
-        </w:rPr>
-      </w:pPr>
       <w:r>
         <w:rPr>
           <w:rFonts w:ascii="Courier New" w:hAnsi="Courier New"/>
@@ -1412,7 +1368,52 @@
           <w:sz w:val="22"/>
           <w:szCs w:val="22"/>
         </w:rPr>
-        <w:t xml:space="preserve">          A remplir</w:t>
+        <w:t xml:space="preserve"> </w:t>
+      </w:r>
+      <w:r>
+        <w:rPr>
+          <w:rFonts w:ascii="Courier New" w:hAnsi="Courier New"/>
+          <w:b/>
+          <w:bCs/>
+          <w:noProof/>
+          <w:sz w:val="22"/>
+          <w:szCs w:val="22"/>
+        </w:rPr>
+        <w:drawing>
+          <wp:inline distT="0" distB="0" distL="0" distR="0">
+            <wp:extent cx="5756910" cy="3593452"/>
+            <wp:effectExtent l="0" t="0" r="0" b="0"/>
+            <wp:docPr id="1" name="Picture 1" descr=""/>
+            <wp:cNvGraphicFramePr/>
+            <a:graphic>
+              <a:graphicData uri="http://schemas.openxmlformats.org/drawingml/2006/picture">
+                <pic:pic>
+                  <pic:nvPicPr>
+                    <pic:cNvPr id="0" name="image1.png" descr=""/>
+                    <pic:cNvPicPr>
+                      <a:picLocks noChangeAspect="1" noChangeArrowheads="1"/>
+                    </pic:cNvPicPr>
+                  </pic:nvPicPr>
+                  <pic:blipFill>
+                    <a:blip r:embed="rId1"/>
+                    <a:stretch>
+                      <a:fillRect/>
+                    </a:stretch>
+                  </pic:blipFill>
+                  <pic:spPr bwMode="auto">
+                    <a:xfrm>
+                      <a:off x="0" y="0"/>
+                      <a:ext cx="5756910" cy="3593452"/>
+                    </a:xfrm>
+                    <a:prstGeom prst="rect">
+                      <a:avLst/>
+                    </a:prstGeom>
+                  </pic:spPr>
+                </pic:pic>
+              </a:graphicData>
+            </a:graphic>
+          </wp:inline>
+        </w:drawing>
       </w:r>
     </w:p>
     <w:p>
@@ -1425,56 +1426,6 @@
           <w:noProof/>
           <w:sz w:val="22"/>
           <w:szCs w:val="22"/>
-        </w:rPr>
-      </w:pPr>
-    </w:p>
-    <w:p>
-      <w:pPr>
-        <w:ind w:left="567"/>
-        <w:rPr>
-          <w:rFonts w:ascii="Courier New" w:hAnsi="Courier New"/>
-          <w:noProof/>
-          <w:sz w:val="17"/>
-        </w:rPr>
-      </w:pPr>
-    </w:p>
-    <w:p>
-      <w:pPr>
-        <w:ind w:left="567"/>
-        <w:rPr>
-          <w:rFonts w:ascii="Courier New" w:hAnsi="Courier New"/>
-          <w:noProof/>
-          <w:sz w:val="17"/>
-        </w:rPr>
-      </w:pPr>
-    </w:p>
-    <w:p>
-      <w:pPr>
-        <w:ind w:left="567"/>
-        <w:rPr>
-          <w:rFonts w:ascii="Courier New" w:hAnsi="Courier New"/>
-          <w:noProof/>
-          <w:sz w:val="17"/>
-        </w:rPr>
-      </w:pPr>
-    </w:p>
-    <w:p>
-      <w:pPr>
-        <w:ind w:left="567"/>
-        <w:rPr>
-          <w:rFonts w:ascii="Courier New" w:hAnsi="Courier New"/>
-          <w:noProof/>
-          <w:sz w:val="17"/>
-        </w:rPr>
-      </w:pPr>
-    </w:p>
-    <w:p>
-      <w:pPr>
-        <w:ind w:left="567"/>
-        <w:rPr>
-          <w:rFonts w:ascii="Courier New" w:hAnsi="Courier New"/>
-          <w:noProof/>
-          <w:sz w:val="17"/>
         </w:rPr>
       </w:pPr>
     </w:p>

</xml_diff>